<commit_message>
Add UAV-cooperative layer, strategy study, and October 2026 review docs
- Backend: UAVAgent with lawnmower, threat-informed, target-informed and
  hybrid coverage; uav_intelligence store; temporal-decay penalties in
  build_penalized_graph; GET /api/sim/uav
- Frontend: UAV marker, detection ring and intel overlay in mission.html
- Evaluation: --uav-strategy harness at 4x, V2 stress profile, 300-mission
  results (5 strategies x 2 densities), MPI, statistics, weight-sensitivity
  and tier scripts, figures
- New analysis tools: evaluation/reanalysis.py re-derives every study
  statistic from the CSVs; evaluation/headless_probe.py runs paired
  missions against the backend module without Docker
- Docs: SAR_UGV_Journal.md v13, SAR_UGV_Overview.docx and FUTURE_WORK.md
  updated to the current state, including the known issues found in a
  full code and data review

Co-Authored-By: Claude Opus 5.5 <noreply@anthropic.com>
</commit_message>
<xml_diff>
--- a/SAR_UGV_Overview.docx
+++ b/SAR_UGV_Overview.docx
@@ -64,9 +64,14 @@
           <w:szCs w:val="16"/>
           <w:lang w:val="en-GB"/>
         </w:rPr>
-        <w:t xml:space="preserve">                                       </w:t>
-      </w:r>
-      <w:r>
+        <w:t xml:space="preserve">                                       Spyridon Tsilimpokos                           Ilias Panagiotopoulos                            George Dimitrakopoulos </w:t>
+        <w:br/>
+        <w:t xml:space="preserve">                                  Informatics &amp; Telematics Dept.               Military Sciences Dept.                    Informatics &amp; Telematics Dept.</w:t>
+      </w:r>
+    </w:p>
+    <w:p>
+      <w:pPr>
+        <w:spacing w:after="40"/>
         <w:rPr>
           <w:rFonts w:ascii="Times New Roman" w:hAnsi="Times New Roman" w:cs="Times New Roman"/>
           <w:b/>
@@ -76,9 +81,7 @@
           <w:szCs w:val="16"/>
           <w:lang w:val="en-GB"/>
         </w:rPr>
-        <w:t xml:space="preserve">Spyridon </w:t>
-      </w:r>
-      <w:proofErr w:type="spellStart"/>
+      </w:pPr>
       <w:r>
         <w:rPr>
           <w:rFonts w:ascii="Times New Roman" w:hAnsi="Times New Roman" w:cs="Times New Roman"/>
@@ -89,270 +92,7 @@
           <w:szCs w:val="16"/>
           <w:lang w:val="en-GB"/>
         </w:rPr>
-        <w:t>Tsilimpoko</w:t>
-      </w:r>
-      <w:r>
-        <w:rPr>
-          <w:rFonts w:ascii="Times New Roman" w:hAnsi="Times New Roman" w:cs="Times New Roman"/>
-          <w:b/>
-          <w:bCs/>
-          <w:color w:val="3B3838" w:themeColor="background2" w:themeShade="40"/>
-          <w:sz w:val="16"/>
-          <w:szCs w:val="16"/>
-          <w:lang w:val="en-GB"/>
-        </w:rPr>
-        <w:t>s</w:t>
-      </w:r>
-      <w:proofErr w:type="spellEnd"/>
-      <w:r>
-        <w:rPr>
-          <w:rFonts w:ascii="Times New Roman" w:hAnsi="Times New Roman" w:cs="Times New Roman"/>
-          <w:b/>
-          <w:bCs/>
-          <w:color w:val="3B3838" w:themeColor="background2" w:themeShade="40"/>
-          <w:sz w:val="16"/>
-          <w:szCs w:val="16"/>
-          <w:lang w:val="en-GB"/>
-        </w:rPr>
-        <w:t xml:space="preserve">                           </w:t>
-      </w:r>
-      <w:proofErr w:type="spellStart"/>
-      <w:r>
-        <w:rPr>
-          <w:rFonts w:ascii="Times New Roman" w:hAnsi="Times New Roman" w:cs="Times New Roman"/>
-          <w:b/>
-          <w:bCs/>
-          <w:color w:val="3B3838" w:themeColor="background2" w:themeShade="40"/>
-          <w:sz w:val="16"/>
-          <w:szCs w:val="16"/>
-          <w:lang w:val="en-GB"/>
-        </w:rPr>
-        <w:t>Ilias</w:t>
-      </w:r>
-      <w:proofErr w:type="spellEnd"/>
-      <w:r>
-        <w:rPr>
-          <w:rFonts w:ascii="Times New Roman" w:hAnsi="Times New Roman" w:cs="Times New Roman"/>
-          <w:b/>
-          <w:bCs/>
-          <w:color w:val="3B3838" w:themeColor="background2" w:themeShade="40"/>
-          <w:sz w:val="16"/>
-          <w:szCs w:val="16"/>
-          <w:lang w:val="en-GB"/>
-        </w:rPr>
-        <w:t xml:space="preserve"> </w:t>
-      </w:r>
-      <w:proofErr w:type="spellStart"/>
-      <w:r>
-        <w:rPr>
-          <w:rFonts w:ascii="Times New Roman" w:hAnsi="Times New Roman" w:cs="Times New Roman"/>
-          <w:b/>
-          <w:bCs/>
-          <w:color w:val="3B3838" w:themeColor="background2" w:themeShade="40"/>
-          <w:sz w:val="16"/>
-          <w:szCs w:val="16"/>
-          <w:lang w:val="en-GB"/>
-        </w:rPr>
-        <w:t>Panagiotopoulos</w:t>
-      </w:r>
-      <w:proofErr w:type="spellEnd"/>
-      <w:r>
-        <w:rPr>
-          <w:rFonts w:ascii="Times New Roman" w:hAnsi="Times New Roman" w:cs="Times New Roman"/>
-          <w:b/>
-          <w:bCs/>
-          <w:color w:val="3B3838" w:themeColor="background2" w:themeShade="40"/>
-          <w:sz w:val="16"/>
-          <w:szCs w:val="16"/>
-          <w:lang w:val="en-GB"/>
-        </w:rPr>
-        <w:t xml:space="preserve">                            George Dimitrakopoulos </w:t>
-      </w:r>
-      <w:r>
-        <w:rPr>
-          <w:rFonts w:ascii="Times New Roman" w:hAnsi="Times New Roman" w:cs="Times New Roman"/>
-          <w:b/>
-          <w:bCs/>
-          <w:color w:val="3B3838" w:themeColor="background2" w:themeShade="40"/>
-          <w:sz w:val="16"/>
-          <w:szCs w:val="16"/>
-          <w:lang w:val="en-GB"/>
-        </w:rPr>
-        <w:br/>
-      </w:r>
-      <w:r>
-        <w:rPr>
-          <w:rFonts w:ascii="Times New Roman" w:hAnsi="Times New Roman" w:cs="Times New Roman"/>
-          <w:b/>
-          <w:bCs/>
-          <w:color w:val="3B3838" w:themeColor="background2" w:themeShade="40"/>
-          <w:sz w:val="16"/>
-          <w:szCs w:val="16"/>
-          <w:lang w:val="en-GB"/>
-        </w:rPr>
-        <w:t xml:space="preserve">                                  </w:t>
-      </w:r>
-      <w:r>
-        <w:rPr>
-          <w:rFonts w:ascii="Times New Roman" w:hAnsi="Times New Roman" w:cs="Times New Roman"/>
-          <w:b/>
-          <w:bCs/>
-          <w:color w:val="3B3838" w:themeColor="background2" w:themeShade="40"/>
-          <w:sz w:val="16"/>
-          <w:szCs w:val="16"/>
-          <w:lang w:val="en-GB"/>
-        </w:rPr>
-        <w:t>Informatics &amp; Telematics Dept.</w:t>
-      </w:r>
-      <w:r>
-        <w:rPr>
-          <w:rFonts w:ascii="Times New Roman" w:hAnsi="Times New Roman" w:cs="Times New Roman"/>
-          <w:b/>
-          <w:bCs/>
-          <w:color w:val="3B3838" w:themeColor="background2" w:themeShade="40"/>
-          <w:sz w:val="16"/>
-          <w:szCs w:val="16"/>
-          <w:lang w:val="en-GB"/>
-        </w:rPr>
-        <w:t xml:space="preserve">               </w:t>
-      </w:r>
-      <w:r>
-        <w:rPr>
-          <w:rFonts w:ascii="Times New Roman" w:hAnsi="Times New Roman" w:cs="Times New Roman"/>
-          <w:b/>
-          <w:bCs/>
-          <w:color w:val="3B3838" w:themeColor="background2" w:themeShade="40"/>
-          <w:sz w:val="16"/>
-          <w:szCs w:val="16"/>
-          <w:lang w:val="en-GB"/>
-        </w:rPr>
-        <w:t>Military Sciences Dept.</w:t>
-      </w:r>
-      <w:r>
-        <w:rPr>
-          <w:rFonts w:ascii="Times New Roman" w:hAnsi="Times New Roman" w:cs="Times New Roman"/>
-          <w:b/>
-          <w:bCs/>
-          <w:color w:val="3B3838" w:themeColor="background2" w:themeShade="40"/>
-          <w:sz w:val="16"/>
-          <w:szCs w:val="16"/>
-          <w:lang w:val="en-GB"/>
-        </w:rPr>
-        <w:t xml:space="preserve">                    Informatics &amp; Telematics Dept.</w:t>
-      </w:r>
-    </w:p>
-    <w:p>
-      <w:pPr>
-        <w:spacing w:after="40"/>
-        <w:rPr>
-          <w:rFonts w:ascii="Times New Roman" w:hAnsi="Times New Roman" w:cs="Times New Roman"/>
-          <w:b/>
-          <w:bCs/>
-          <w:color w:val="3B3838" w:themeColor="background2" w:themeShade="40"/>
-          <w:sz w:val="16"/>
-          <w:szCs w:val="16"/>
-          <w:lang w:val="en-GB"/>
-        </w:rPr>
-      </w:pPr>
-      <w:r>
-        <w:rPr>
-          <w:rFonts w:ascii="Times New Roman" w:hAnsi="Times New Roman" w:cs="Times New Roman"/>
-          <w:b/>
-          <w:bCs/>
-          <w:color w:val="3B3838" w:themeColor="background2" w:themeShade="40"/>
-          <w:sz w:val="16"/>
-          <w:szCs w:val="16"/>
-          <w:lang w:val="en-GB"/>
-        </w:rPr>
-        <w:t xml:space="preserve">                                        </w:t>
-      </w:r>
-      <w:proofErr w:type="spellStart"/>
-      <w:r>
-        <w:rPr>
-          <w:rFonts w:ascii="Times New Roman" w:hAnsi="Times New Roman" w:cs="Times New Roman"/>
-          <w:b/>
-          <w:bCs/>
-          <w:color w:val="3B3838" w:themeColor="background2" w:themeShade="40"/>
-          <w:sz w:val="16"/>
-          <w:szCs w:val="16"/>
-          <w:lang w:val="en-GB"/>
-        </w:rPr>
-        <w:t>Harokopio</w:t>
-      </w:r>
-      <w:proofErr w:type="spellEnd"/>
-      <w:r>
-        <w:rPr>
-          <w:rFonts w:ascii="Times New Roman" w:hAnsi="Times New Roman" w:cs="Times New Roman"/>
-          <w:b/>
-          <w:bCs/>
-          <w:color w:val="3B3838" w:themeColor="background2" w:themeShade="40"/>
-          <w:sz w:val="16"/>
-          <w:szCs w:val="16"/>
-          <w:lang w:val="en-GB"/>
-        </w:rPr>
-        <w:t xml:space="preserve"> University</w:t>
-      </w:r>
-      <w:r>
-        <w:rPr>
-          <w:rFonts w:ascii="Times New Roman" w:hAnsi="Times New Roman" w:cs="Times New Roman"/>
-          <w:b/>
-          <w:bCs/>
-          <w:color w:val="3B3838" w:themeColor="background2" w:themeShade="40"/>
-          <w:sz w:val="16"/>
-          <w:szCs w:val="16"/>
-          <w:lang w:val="en-GB"/>
-        </w:rPr>
-        <w:t xml:space="preserve">                        </w:t>
-      </w:r>
-      <w:r>
-        <w:rPr>
-          <w:rFonts w:ascii="Times New Roman" w:hAnsi="Times New Roman" w:cs="Times New Roman"/>
-          <w:b/>
-          <w:bCs/>
-          <w:color w:val="3B3838" w:themeColor="background2" w:themeShade="40"/>
-          <w:sz w:val="16"/>
-          <w:szCs w:val="16"/>
-          <w:lang w:val="en-GB"/>
-        </w:rPr>
-        <w:t>Hellenic Army Academy</w:t>
-      </w:r>
-      <w:r>
-        <w:rPr>
-          <w:rFonts w:ascii="Times New Roman" w:hAnsi="Times New Roman" w:cs="Times New Roman"/>
-          <w:b/>
-          <w:bCs/>
-          <w:color w:val="3B3838" w:themeColor="background2" w:themeShade="40"/>
-          <w:sz w:val="16"/>
-          <w:szCs w:val="16"/>
-          <w:lang w:val="en-GB"/>
-        </w:rPr>
-        <w:t xml:space="preserve">                           </w:t>
-      </w:r>
-      <w:proofErr w:type="spellStart"/>
-      <w:r>
-        <w:rPr>
-          <w:rFonts w:ascii="Times New Roman" w:hAnsi="Times New Roman" w:cs="Times New Roman"/>
-          <w:b/>
-          <w:bCs/>
-          <w:color w:val="3B3838" w:themeColor="background2" w:themeShade="40"/>
-          <w:sz w:val="16"/>
-          <w:szCs w:val="16"/>
-          <w:lang w:val="en-GB"/>
-        </w:rPr>
-        <w:t>Harokopio</w:t>
-      </w:r>
-      <w:proofErr w:type="spellEnd"/>
-      <w:r>
-        <w:rPr>
-          <w:rFonts w:ascii="Times New Roman" w:hAnsi="Times New Roman" w:cs="Times New Roman"/>
-          <w:b/>
-          <w:bCs/>
-          <w:color w:val="3B3838" w:themeColor="background2" w:themeShade="40"/>
-          <w:sz w:val="16"/>
-          <w:szCs w:val="16"/>
-          <w:lang w:val="en-GB"/>
-        </w:rPr>
-        <w:t xml:space="preserve"> University</w:t>
+        <w:t xml:space="preserve">                                        Harokopio University                        Hellenic Army Academy                           Harokopio University</w:t>
       </w:r>
       <w:r>
         <w:rPr>
@@ -378,67 +118,7 @@
           <w:szCs w:val="16"/>
           <w:lang w:val="en-GB"/>
         </w:rPr>
-        <w:t xml:space="preserve">                                              </w:t>
-      </w:r>
-      <w:r>
-        <w:rPr>
-          <w:rFonts w:ascii="Times New Roman" w:hAnsi="Times New Roman" w:cs="Times New Roman"/>
-          <w:b/>
-          <w:bCs/>
-          <w:color w:val="3B3838" w:themeColor="background2" w:themeShade="40"/>
-          <w:sz w:val="16"/>
-          <w:szCs w:val="16"/>
-          <w:lang w:val="en-GB"/>
-        </w:rPr>
-        <w:t>Athens, Greece</w:t>
-      </w:r>
-      <w:r>
-        <w:rPr>
-          <w:rFonts w:ascii="Times New Roman" w:hAnsi="Times New Roman" w:cs="Times New Roman"/>
-          <w:b/>
-          <w:bCs/>
-          <w:color w:val="3B3838" w:themeColor="background2" w:themeShade="40"/>
-          <w:sz w:val="16"/>
-          <w:szCs w:val="16"/>
-          <w:lang w:val="en-GB"/>
-        </w:rPr>
-        <w:t xml:space="preserve">                                       </w:t>
-      </w:r>
-      <w:r>
-        <w:rPr>
-          <w:rFonts w:ascii="Times New Roman" w:hAnsi="Times New Roman" w:cs="Times New Roman"/>
-          <w:b/>
-          <w:bCs/>
-          <w:color w:val="3B3838" w:themeColor="background2" w:themeShade="40"/>
-          <w:sz w:val="16"/>
-          <w:szCs w:val="16"/>
-          <w:lang w:val="en-GB"/>
-        </w:rPr>
-        <w:t>Vari, Greece</w:t>
-      </w:r>
-      <w:r>
-        <w:rPr>
-          <w:rFonts w:ascii="Times New Roman" w:hAnsi="Times New Roman" w:cs="Times New Roman"/>
-          <w:b/>
-          <w:bCs/>
-          <w:color w:val="3B3838" w:themeColor="background2" w:themeShade="40"/>
-          <w:sz w:val="16"/>
-          <w:szCs w:val="16"/>
-          <w:lang w:val="en-GB"/>
-        </w:rPr>
-        <w:t xml:space="preserve">                                           </w:t>
-      </w:r>
-      <w:r>
-        <w:rPr>
-          <w:rFonts w:ascii="Times New Roman" w:hAnsi="Times New Roman" w:cs="Times New Roman"/>
-          <w:b/>
-          <w:bCs/>
-          <w:color w:val="3B3838" w:themeColor="background2" w:themeShade="40"/>
-          <w:sz w:val="16"/>
-          <w:szCs w:val="16"/>
-          <w:lang w:val="en-GB"/>
-        </w:rPr>
-        <w:t>Athens, Greece</w:t>
+        <w:t xml:space="preserve">                                              Athens, Greece                                       Vari, Greece                                           Athens, Greece</w:t>
       </w:r>
       <w:r>
         <w:rPr>
@@ -468,7 +148,7 @@
           <w:sz w:val="19"/>
           <w:szCs w:val="19"/>
         </w:rPr>
-        <w:t>Web-Based Multi-Agent Mission Planning &amp; Simulation on Real-World Street Networks</w:t>
+        <w:t>Web-Based Multi-Agent and UAV-Cooperative Mission Simulation on Real-World Street Networks · Updated October 2026</w:t>
       </w:r>
     </w:p>
     <w:p>
@@ -502,31 +182,7 @@
         <w:rPr>
           <w:rFonts w:ascii="Times New Roman" w:hAnsi="Times New Roman" w:cs="Times New Roman"/>
         </w:rPr>
-        <w:t xml:space="preserve">SAR-UGV Simulation is a browser-based platform for planning, previewing, and evaluating autonomous Search and Rescue (SAR) missions before any hardware is deployed. Operators configure agents, threats, and objectives on genuine OpenStreetMap </w:t>
-      </w:r>
-      <w:r>
-        <w:rPr>
-          <w:rFonts w:ascii="Times New Roman" w:hAnsi="Times New Roman" w:cs="Times New Roman"/>
-        </w:rPr>
-        <w:t xml:space="preserve">(OSM) </w:t>
-      </w:r>
-      <w:r>
-        <w:rPr>
-          <w:rFonts w:ascii="Times New Roman" w:hAnsi="Times New Roman" w:cs="Times New Roman"/>
-        </w:rPr>
-        <w:t>street graphs for any city on Earth, run the mission at up to 100× rea</w:t>
-      </w:r>
-      <w:r>
-        <w:rPr>
-          <w:rFonts w:ascii="Times New Roman" w:hAnsi="Times New Roman" w:cs="Times New Roman"/>
-        </w:rPr>
-        <w:t>l time, and review the outcome,</w:t>
-      </w:r>
-      <w:r>
-        <w:rPr>
-          <w:rFonts w:ascii="Times New Roman" w:hAnsi="Times New Roman" w:cs="Times New Roman"/>
-        </w:rPr>
-        <w:t xml:space="preserve"> all without a physical vehicle. This makes it a lightweight but realistic mission planner: routes, threat exposure, and scoring can be assessed in seconds, and saved scenarios can be replayed with different parameters to compare strategies.</w:t>
+        <w:t xml:space="preserve">SAR-UGV Simulation is a browser-based platform for planning, previewing, and evaluating autonomous Search and Rescue (SAR) missions before any hardware is deployed. Operators configure agents, threats, and objectives on genuine OpenStreetMap (OSM) street graphs for any location on Earth, run the mission faster than real time, and review the outcome, all without a physical vehicle. This makes it a lightweight but realistic mission planner: routes, threat exposure, and scoring can be assessed in minutes, and saved scenarios can be replayed to compare strategies.</w:t>
       </w:r>
     </w:p>
     <w:p>
@@ -541,33 +197,7 @@
         <w:rPr>
           <w:rFonts w:ascii="Times New Roman" w:hAnsi="Times New Roman" w:cs="Times New Roman"/>
         </w:rPr>
-        <w:t xml:space="preserve">The platform evolved from an earlier </w:t>
-      </w:r>
-      <w:proofErr w:type="spellStart"/>
-      <w:r>
-        <w:rPr>
-          <w:rFonts w:ascii="Times New Roman" w:hAnsi="Times New Roman" w:cs="Times New Roman"/>
-        </w:rPr>
-        <w:t>Pygame</w:t>
-      </w:r>
-      <w:proofErr w:type="spellEnd"/>
-      <w:r>
-        <w:rPr>
-          <w:rFonts w:ascii="Times New Roman" w:hAnsi="Times New Roman" w:cs="Times New Roman"/>
-        </w:rPr>
-        <w:t xml:space="preserve"> prototype that proved the core AI pipeline on a synthetic grid. </w:t>
-      </w:r>
-      <w:r>
-        <w:rPr>
-          <w:rFonts w:ascii="Times New Roman" w:hAnsi="Times New Roman" w:cs="Times New Roman"/>
-        </w:rPr>
-        <w:t>The current v</w:t>
-      </w:r>
-      <w:r>
-        <w:rPr>
-          <w:rFonts w:ascii="Times New Roman" w:hAnsi="Times New Roman" w:cs="Times New Roman"/>
-        </w:rPr>
-        <w:t>ersion extends this on real street topology, delivered entirely through a browser with no local installation beyond Docker.</w:t>
+        <w:t xml:space="preserve">The platform evolved from an earlier Pygame prototype that proved the core AI pipeline on a synthetic grid. The current version extends this on real street topology, delivered entirely through a browser with no local installation beyond Docker. Since July 2026 an optional aerial agent (UAV) scouts the mission area for the ground planner (Section 4), and a 300-mission study compares four UAV coverage strategies (Section 7).</w:t>
       </w:r>
     </w:p>
     <w:p>
@@ -699,21 +329,7 @@
         <w:rPr>
           <w:rFonts w:ascii="Times New Roman" w:hAnsi="Times New Roman" w:cs="Times New Roman"/>
         </w:rPr>
-        <w:t xml:space="preserve">The separation of concerns is deliberate: the backend is a pure AI and physics server; the frontend is 100% static HTML/CSS/JS served by nginx, with no build pipeline or JavaScript framework. The entire frontend </w:t>
-      </w:r>
-      <w:proofErr w:type="spellStart"/>
-      <w:r>
-        <w:rPr>
-          <w:rFonts w:ascii="Times New Roman" w:hAnsi="Times New Roman" w:cs="Times New Roman"/>
-        </w:rPr>
-        <w:t>Dockerfile</w:t>
-      </w:r>
-      <w:proofErr w:type="spellEnd"/>
-      <w:r>
-        <w:rPr>
-          <w:rFonts w:ascii="Times New Roman" w:hAnsi="Times New Roman" w:cs="Times New Roman"/>
-        </w:rPr>
-        <w:t xml:space="preserve"> is a single COPY instruction, making the codebase fully auditable with a text editor and a browser DevTools panel.</w:t>
+        <w:t xml:space="preserve">The separation of concerns is deliberate: the backend is a pure AI and physics server; the frontend is 100% static HTML/CSS/JS served by nginx, with no build pipeline or JavaScript framework. Five pages are served: the mission planner and scenario editor (Leaflet), a 3-D live monitor with building extrusions and the UAV overlay (MapLibre GL), a robot-eye camera and LiDAR dashboard (Three.js), and analytics (Chart.js).</w:t>
       </w:r>
     </w:p>
     <w:p>
@@ -743,21 +359,12 @@
           <w:color w:val="000000" w:themeColor="text1"/>
         </w:rPr>
       </w:pPr>
-      <w:proofErr w:type="gramStart"/>
       <w:r>
         <w:rPr>
           <w:rFonts w:ascii="Times New Roman" w:hAnsi="Times New Roman" w:cs="Times New Roman"/>
           <w:color w:val="000000" w:themeColor="text1"/>
         </w:rPr>
-        <w:t>3.1  Risk</w:t>
-      </w:r>
-      <w:proofErr w:type="gramEnd"/>
-      <w:r>
-        <w:rPr>
-          <w:rFonts w:ascii="Times New Roman" w:hAnsi="Times New Roman" w:cs="Times New Roman"/>
-          <w:color w:val="000000" w:themeColor="text1"/>
-        </w:rPr>
-        <w:t>-Weighted A* Pathfinding</w:t>
+        <w:t>3.1  Risk-Weighted Route Planning</w:t>
       </w:r>
     </w:p>
     <w:p>
@@ -772,7 +379,7 @@
         <w:rPr>
           <w:rFonts w:ascii="Times New Roman" w:hAnsi="Times New Roman" w:cs="Times New Roman"/>
         </w:rPr>
-        <w:t>At every replanning cycle the backend constructs an augmented copy of the OSM graph where each edge weight encodes both terrain cost and enemy threat. Road type multipliers (0.80× on fast arterials, up to 4.0× on footpaths) bias agents toward efficient routes. Tiered proximity penalties are then added to every edge near an enemy:</w:t>
+        <w:t>At every replanning cycle the backend builds an augmented copy of the OSM graph in which each edge weight encodes terrain cost, enemy threat and, when used, a geofence and UAV intelligence; a weighted shortest-path search (Dijkstra) then selects the route. Road-type multipliers (0.80× on motorways up to 4.0× on steps) bias agents toward efficient roads, and tiered proximity penalties are added to every edge near a known enemy:</w:t>
       </w:r>
     </w:p>
     <w:p>
@@ -952,7 +559,7 @@
                 <w:sz w:val="18"/>
                 <w:szCs w:val="18"/>
               </w:rPr>
-              <w:t>&lt; 10 m</w:t>
+              <w:t>0 m (on the enemy)</w:t>
             </w:r>
           </w:p>
         </w:tc>
@@ -985,15 +592,7 @@
                 <w:sz w:val="18"/>
                 <w:szCs w:val="18"/>
               </w:rPr>
-              <w:t>+3</w:t>
-            </w:r>
-            <w:r>
-              <w:rPr>
-                <w:rFonts w:ascii="Times New Roman" w:hAnsi="Times New Roman" w:cs="Times New Roman"/>
-                <w:sz w:val="18"/>
-                <w:szCs w:val="18"/>
-              </w:rPr>
-              <w:t>000</w:t>
+              <w:t>+8000</w:t>
             </w:r>
           </w:p>
         </w:tc>
@@ -1025,15 +624,7 @@
                 <w:sz w:val="18"/>
                 <w:szCs w:val="18"/>
               </w:rPr>
-              <w:t>Extreme danger -</w:t>
-            </w:r>
-            <w:r>
-              <w:rPr>
-                <w:rFonts w:ascii="Times New Roman" w:hAnsi="Times New Roman" w:cs="Times New Roman"/>
-                <w:sz w:val="18"/>
-                <w:szCs w:val="18"/>
-              </w:rPr>
-              <w:t xml:space="preserve"> near-certain contact</w:t>
+              <w:t xml:space="preserve">Effectively impassable</w:t>
             </w:r>
           </w:p>
         </w:tc>
@@ -1071,6 +662,109 @@
                 <w:sz w:val="18"/>
                 <w:szCs w:val="18"/>
               </w:rPr>
+              <w:t>&lt; 10 m</w:t>
+            </w:r>
+          </w:p>
+        </w:tc>
+        <w:tc>
+          <w:tcPr>
+            <w:tcW w:w="1800" w:type="dxa"/>
+            <w:tcBorders>
+              <w:top w:val="single" w:sz="1" w:space="0" w:color="BBBBBB"/>
+              <w:left w:val="single" w:sz="1" w:space="0" w:color="BBBBBB"/>
+              <w:bottom w:val="single" w:sz="1" w:space="0" w:color="BBBBBB"/>
+              <w:right w:val="single" w:sz="1" w:space="0" w:color="BBBBBB"/>
+            </w:tcBorders>
+            <w:tcMar>
+              <w:top w:w="60" w:type="dxa"/>
+              <w:left w:w="100" w:type="dxa"/>
+              <w:bottom w:w="60" w:type="dxa"/>
+              <w:right w:w="100" w:type="dxa"/>
+            </w:tcMar>
+          </w:tcPr>
+          <w:p>
+            <w:pPr>
+              <w:jc w:val="center"/>
+              <w:rPr>
+                <w:rFonts w:ascii="Times New Roman" w:hAnsi="Times New Roman" w:cs="Times New Roman"/>
+              </w:rPr>
+            </w:pPr>
+            <w:r>
+              <w:rPr>
+                <w:rFonts w:ascii="Times New Roman" w:hAnsi="Times New Roman" w:cs="Times New Roman"/>
+                <w:sz w:val="18"/>
+                <w:szCs w:val="18"/>
+              </w:rPr>
+              <w:t>+3000</w:t>
+            </w:r>
+          </w:p>
+        </w:tc>
+        <w:tc>
+          <w:tcPr>
+            <w:tcW w:w="3700" w:type="dxa"/>
+            <w:tcBorders>
+              <w:top w:val="single" w:sz="1" w:space="0" w:color="BBBBBB"/>
+              <w:left w:val="single" w:sz="1" w:space="0" w:color="BBBBBB"/>
+              <w:bottom w:val="single" w:sz="1" w:space="0" w:color="BBBBBB"/>
+              <w:right w:val="single" w:sz="1" w:space="0" w:color="BBBBBB"/>
+            </w:tcBorders>
+            <w:tcMar>
+              <w:top w:w="60" w:type="dxa"/>
+              <w:left w:w="100" w:type="dxa"/>
+              <w:bottom w:w="60" w:type="dxa"/>
+              <w:right w:w="100" w:type="dxa"/>
+            </w:tcMar>
+          </w:tcPr>
+          <w:p>
+            <w:pPr>
+              <w:rPr>
+                <w:rFonts w:ascii="Times New Roman" w:hAnsi="Times New Roman" w:cs="Times New Roman"/>
+              </w:rPr>
+            </w:pPr>
+            <w:r>
+              <w:rPr>
+                <w:rFonts w:ascii="Times New Roman" w:hAnsi="Times New Roman" w:cs="Times New Roman"/>
+                <w:sz w:val="18"/>
+                <w:szCs w:val="18"/>
+              </w:rPr>
+              <w:t xml:space="preserve">Extreme danger - near-certain contact</w:t>
+            </w:r>
+          </w:p>
+        </w:tc>
+      </w:tr>
+      <w:tr>
+        <w:trPr>
+          <w:jc w:val="center"/>
+        </w:trPr>
+        <w:tc>
+          <w:tcPr>
+            <w:tcW w:w="2600" w:type="dxa"/>
+            <w:tcBorders>
+              <w:top w:val="single" w:sz="1" w:space="0" w:color="BBBBBB"/>
+              <w:left w:val="single" w:sz="1" w:space="0" w:color="BBBBBB"/>
+              <w:bottom w:val="single" w:sz="1" w:space="0" w:color="BBBBBB"/>
+              <w:right w:val="single" w:sz="1" w:space="0" w:color="BBBBBB"/>
+            </w:tcBorders>
+            <w:tcMar>
+              <w:top w:w="60" w:type="dxa"/>
+              <w:left w:w="100" w:type="dxa"/>
+              <w:bottom w:w="60" w:type="dxa"/>
+              <w:right w:w="100" w:type="dxa"/>
+            </w:tcMar>
+          </w:tcPr>
+          <w:p>
+            <w:pPr>
+              <w:jc w:val="center"/>
+              <w:rPr>
+                <w:rFonts w:ascii="Times New Roman" w:hAnsi="Times New Roman" w:cs="Times New Roman"/>
+              </w:rPr>
+            </w:pPr>
+            <w:r>
+              <w:rPr>
+                <w:rFonts w:ascii="Times New Roman" w:hAnsi="Times New Roman" w:cs="Times New Roman"/>
+                <w:sz w:val="18"/>
+                <w:szCs w:val="18"/>
+              </w:rPr>
               <w:t>&lt; 30 m</w:t>
             </w:r>
           </w:p>
@@ -1104,15 +798,7 @@
                 <w:sz w:val="18"/>
                 <w:szCs w:val="18"/>
               </w:rPr>
-              <w:t>+1</w:t>
-            </w:r>
-            <w:r>
-              <w:rPr>
-                <w:rFonts w:ascii="Times New Roman" w:hAnsi="Times New Roman" w:cs="Times New Roman"/>
-                <w:sz w:val="18"/>
-                <w:szCs w:val="18"/>
-              </w:rPr>
-              <w:t>500</w:t>
+              <w:t>+1500</w:t>
             </w:r>
           </w:p>
         </w:tc>
@@ -1144,15 +830,7 @@
                 <w:sz w:val="18"/>
                 <w:szCs w:val="18"/>
               </w:rPr>
-              <w:t>High danger -</w:t>
-            </w:r>
-            <w:r>
-              <w:rPr>
-                <w:rFonts w:ascii="Times New Roman" w:hAnsi="Times New Roman" w:cs="Times New Roman"/>
-                <w:sz w:val="18"/>
-                <w:szCs w:val="18"/>
-              </w:rPr>
-              <w:t xml:space="preserve"> direct observation range</w:t>
+              <w:t xml:space="preserve">High danger - direct observation range</w:t>
             </w:r>
           </w:p>
         </w:tc>
@@ -1487,7 +1165,7 @@
         <w:rPr>
           <w:rFonts w:ascii="Times New Roman" w:hAnsi="Times New Roman" w:cs="Times New Roman"/>
         </w:rPr>
-        <w:t>Aggressive enemies receive a further 1.5× multiplier on all penalties. This single unified cost function replaces an otherwise complex set of explicit avoidance rules.</w:t>
+        <w:t>Enemies that are actively chasing receive a further 1.5× multiplier, edges outside a geofence receive +6000, and UAV sightings add the temporal-decay penalty of Section 4. This single unified cost function replaces an otherwise complex set of explicit avoidance rules.</w:t>
       </w:r>
     </w:p>
     <w:p>
@@ -1498,21 +1176,12 @@
           <w:color w:val="000000" w:themeColor="text1"/>
         </w:rPr>
       </w:pPr>
-      <w:proofErr w:type="gramStart"/>
       <w:r>
         <w:rPr>
           <w:rFonts w:ascii="Times New Roman" w:hAnsi="Times New Roman" w:cs="Times New Roman"/>
           <w:color w:val="000000" w:themeColor="text1"/>
         </w:rPr>
-        <w:t>3.2  Dead</w:t>
-      </w:r>
-      <w:proofErr w:type="gramEnd"/>
-      <w:r>
-        <w:rPr>
-          <w:rFonts w:ascii="Times New Roman" w:hAnsi="Times New Roman" w:cs="Times New Roman"/>
-          <w:color w:val="000000" w:themeColor="text1"/>
-        </w:rPr>
-        <w:t>-End Avoidance</w:t>
+        <w:t>3.2  Dead-End Avoidance</w:t>
       </w:r>
     </w:p>
     <w:p>
@@ -1527,7 +1196,7 @@
         <w:rPr>
           <w:rFonts w:ascii="Times New Roman" w:hAnsi="Times New Roman" w:cs="Times New Roman"/>
         </w:rPr>
-        <w:t>Edges leading to cul-de-sac nodes (graph degree ≤ 1) carry an additional +200 cost penalty. An agent trapped in a dead end must retrace its path, giving any pursuer a predictable intercept vector. In testing, this penalty reduced enemy-contact events at dead ends by approximately 30%.</w:t>
+        <w:t xml:space="preserve">Nodes of graph degree ≤ 1 are marked as dead ends. An agent trapped in a cul-de-sac must retrace its path, giving any pursuer a predictable intercept vector, so targets located on dead ends cost an extra +200 during target selection and the maneuver check below refuses them.</w:t>
       </w:r>
     </w:p>
     <w:p>
@@ -1538,21 +1207,12 @@
           <w:color w:val="000000" w:themeColor="text1"/>
         </w:rPr>
       </w:pPr>
-      <w:proofErr w:type="gramStart"/>
       <w:r>
         <w:rPr>
           <w:rFonts w:ascii="Times New Roman" w:hAnsi="Times New Roman" w:cs="Times New Roman"/>
           <w:color w:val="000000" w:themeColor="text1"/>
         </w:rPr>
-        <w:t>3.3  Per</w:t>
-      </w:r>
-      <w:proofErr w:type="gramEnd"/>
-      <w:r>
-        <w:rPr>
-          <w:rFonts w:ascii="Times New Roman" w:hAnsi="Times New Roman" w:cs="Times New Roman"/>
-          <w:color w:val="000000" w:themeColor="text1"/>
-        </w:rPr>
-        <w:t>-Agent Decision Tree</w:t>
+        <w:t>3.3  Per-Agent Decision Tree</w:t>
       </w:r>
     </w:p>
     <w:p>
@@ -1567,7 +1227,7 @@
         <w:rPr>
           <w:rFonts w:ascii="Times New Roman" w:hAnsi="Times New Roman" w:cs="Times New Roman"/>
         </w:rPr>
-        <w:t>Each agent evaluates the following logic independently on every simulation tick:</w:t>
+        <w:t>Each agent re-plans every 12 ticks, or at once when an enemy comes within 15 m:</w:t>
       </w:r>
     </w:p>
     <w:p>
@@ -1587,7 +1247,7 @@
           <w:rFonts w:ascii="Times New Roman" w:hAnsi="Times New Roman" w:cs="Times New Roman"/>
         </w:rPr>
         <w:lastRenderedPageBreak/>
-        <w:t>Enemy within detection radius? → run a brave check: can the agent reach the nearest target before the enemy closes in?</w:t>
+        <w:t>Known enemy inside the evasion threshold (1.5× the detection radius for a chasing aggressor, 0.8× for a patrol)? → maneuver check: can the agent reach its best target before the enemy does?</w:t>
       </w:r>
     </w:p>
     <w:p>
@@ -1606,7 +1266,7 @@
         <w:rPr>
           <w:rFonts w:ascii="Times New Roman" w:hAnsi="Times New Roman" w:cs="Times New Roman"/>
         </w:rPr>
-        <w:t>If YES → accept the risk and continue (brave mode).</w:t>
+        <w:t>If YES → take the maneuver route to the target.</w:t>
       </w:r>
     </w:p>
     <w:p>
@@ -1625,49 +1285,7 @@
         <w:rPr>
           <w:rFonts w:ascii="Times New Roman" w:hAnsi="Times New Roman" w:cs="Times New Roman"/>
         </w:rPr>
-        <w:t>If NO → enter escape mode: BFS samples a ring of candidate nodes 2–8 hops away, scores each by (</w:t>
-      </w:r>
-      <w:proofErr w:type="spellStart"/>
-      <w:r>
-        <w:rPr>
-          <w:rFonts w:ascii="Times New Roman" w:hAnsi="Times New Roman" w:cs="Times New Roman"/>
-        </w:rPr>
-        <w:t>enemy_turns_away</w:t>
-      </w:r>
-      <w:proofErr w:type="spellEnd"/>
-      <w:r>
-        <w:rPr>
-          <w:rFonts w:ascii="Times New Roman" w:hAnsi="Times New Roman" w:cs="Times New Roman"/>
-        </w:rPr>
-        <w:t xml:space="preserve"> − </w:t>
-      </w:r>
-      <w:proofErr w:type="spellStart"/>
-      <w:r>
-        <w:rPr>
-          <w:rFonts w:ascii="Times New Roman" w:hAnsi="Times New Roman" w:cs="Times New Roman"/>
-        </w:rPr>
-        <w:t>path_length</w:t>
-      </w:r>
-      <w:proofErr w:type="spellEnd"/>
-      <w:r>
-        <w:rPr>
-          <w:rFonts w:ascii="Times New Roman" w:hAnsi="Times New Roman" w:cs="Times New Roman"/>
-        </w:rPr>
-        <w:t xml:space="preserve"> / 4), and routes to the best via A* on the </w:t>
-      </w:r>
-      <w:proofErr w:type="spellStart"/>
-      <w:r>
-        <w:rPr>
-          <w:rFonts w:ascii="Times New Roman" w:hAnsi="Times New Roman" w:cs="Times New Roman"/>
-        </w:rPr>
-        <w:t>penalised</w:t>
-      </w:r>
-      <w:proofErr w:type="spellEnd"/>
-      <w:r>
-        <w:rPr>
-          <w:rFonts w:ascii="Times New Roman" w:hAnsi="Times New Roman" w:cs="Times New Roman"/>
-        </w:rPr>
-        <w:t xml:space="preserve"> graph.</w:t>
+        <w:t xml:space="preserve">If NO → enter escape mode: BFS samples a ring of candidate nodes 2–8 hops away, scores each by (enemy_turns_away − path_length / 4), and routes to the best on the penalised graph.</w:t>
       </w:r>
     </w:p>
     <w:p>
@@ -1686,7 +1304,7 @@
         <w:rPr>
           <w:rFonts w:ascii="Times New Roman" w:hAnsi="Times New Roman" w:cs="Times New Roman"/>
         </w:rPr>
-        <w:t>No enemy in range → pursue assigned target; replan automatically when a target is collected or reassigned.</w:t>
+        <w:t>Otherwise → pursue the cheapest target, with hysteresis against oscillation; every tick the next 24 m of path is checked and cleared if an enemy blocks it.</w:t>
       </w:r>
     </w:p>
     <w:p>
@@ -1697,21 +1315,12 @@
           <w:color w:val="833C0B" w:themeColor="accent2" w:themeShade="80"/>
         </w:rPr>
       </w:pPr>
-      <w:proofErr w:type="gramStart"/>
       <w:r>
         <w:rPr>
           <w:rFonts w:ascii="Times New Roman" w:hAnsi="Times New Roman" w:cs="Times New Roman"/>
           <w:color w:val="000000" w:themeColor="text1"/>
         </w:rPr>
-        <w:t>3.4  Multi</w:t>
-      </w:r>
-      <w:proofErr w:type="gramEnd"/>
-      <w:r>
-        <w:rPr>
-          <w:rFonts w:ascii="Times New Roman" w:hAnsi="Times New Roman" w:cs="Times New Roman"/>
-          <w:color w:val="000000" w:themeColor="text1"/>
-        </w:rPr>
-        <w:t>-Agent Coordination</w:t>
+        <w:t>3.4  Multi-Agent Coordination</w:t>
       </w:r>
     </w:p>
     <w:p>
@@ -1726,33 +1335,38 @@
         <w:rPr>
           <w:rFonts w:ascii="Times New Roman" w:hAnsi="Times New Roman" w:cs="Times New Roman"/>
         </w:rPr>
-        <w:t xml:space="preserve">Up to four agents run simultaneously. At spawn time a greedy distance-based assignment gives each agent its closest unclaimed target, </w:t>
-      </w:r>
-      <w:proofErr w:type="spellStart"/>
-      <w:r>
-        <w:rPr>
-          <w:rFonts w:ascii="Times New Roman" w:hAnsi="Times New Roman" w:cs="Times New Roman"/>
-        </w:rPr>
-        <w:t>maximising</w:t>
-      </w:r>
-      <w:proofErr w:type="spellEnd"/>
-      <w:r>
-        <w:rPr>
-          <w:rFonts w:ascii="Times New Roman" w:hAnsi="Times New Roman" w:cs="Times New Roman"/>
-        </w:rPr>
-        <w:t xml:space="preserve"> spatial coverage at O(n²) cost. Deduplication is implicit: all agents share a single target list, so any collected target disappears immediately and every agent replans to the next nearest unclaimed objective on the following tick </w:t>
-      </w:r>
-      <w:r>
-        <w:rPr>
-          <w:rFonts w:ascii="Times New Roman" w:hAnsi="Times New Roman" w:cs="Times New Roman"/>
-        </w:rPr>
-        <w:t>-</w:t>
-      </w:r>
-      <w:r>
-        <w:rPr>
-          <w:rFonts w:ascii="Times New Roman" w:hAnsi="Times New Roman" w:cs="Times New Roman"/>
-        </w:rPr>
-        <w:t xml:space="preserve"> no explicit messaging required.</w:t>
+        <w:t xml:space="preserve">Up to four agents run simultaneously. At spawn time a greedy distance-based assignment gives each agent its closest unclaimed target, maximising spatial coverage at O(n²) cost. Deduplication is implicit: all agents share a single target list, so any collected target disappears immediately and every agent replans to the next nearest unclaimed objective on the following tick - no explicit messaging required.</w:t>
+      </w:r>
+    </w:p>
+    <w:p>
+      <w:pPr>
+        <w:pStyle w:val="Heading2"/>
+        <w:rPr>
+          <w:rFonts w:ascii="Times New Roman" w:hAnsi="Times New Roman" w:cs="Times New Roman"/>
+          <w:color w:val="000000" w:themeColor="text1"/>
+        </w:rPr>
+      </w:pPr>
+      <w:r>
+        <w:rPr>
+          <w:rFonts w:ascii="Times New Roman" w:hAnsi="Times New Roman" w:cs="Times New Roman"/>
+          <w:color w:val="000000" w:themeColor="text1"/>
+        </w:rPr>
+        <w:t xml:space="preserve">3.5  Onboard Sensors</w:t>
+      </w:r>
+    </w:p>
+    <w:p>
+      <w:pPr>
+        <w:spacing w:after="80"/>
+        <w:jc w:val="both"/>
+        <w:rPr>
+          <w:rFonts w:ascii="Times New Roman" w:hAnsi="Times New Roman" w:cs="Times New Roman"/>
+        </w:rPr>
+      </w:pPr>
+      <w:r>
+        <w:rPr>
+          <w:rFonts w:ascii="Times New Roman" w:hAnsi="Times New Roman" w:cs="Times New Roman"/>
+        </w:rPr>
+        <w:t xml:space="preserve">Each agent carries a simulated camera (90° field of view, 80 m range, line of sight checked against building footprints) and a 36-ray LiDAR (30 m). The camera feeds the set of known enemies and the LiDAR slows the agent at blind corners; aggressive enemies within 1.1× the detection radius count as known even without line of sight.</w:t>
       </w:r>
     </w:p>
     <w:p>
@@ -1771,7 +1385,499 @@
           <w:rFonts w:ascii="Times New Roman" w:hAnsi="Times New Roman" w:cs="Times New Roman"/>
           <w:color w:val="000000" w:themeColor="text1"/>
         </w:rPr>
-        <w:t>4.  Scoring &amp; Mission Outcomes</w:t>
+        <w:t xml:space="preserve">4.  UAV-Cooperative Layer</w:t>
+      </w:r>
+    </w:p>
+    <w:p>
+      <w:pPr>
+        <w:spacing w:after="80"/>
+        <w:jc w:val="both"/>
+        <w:rPr>
+          <w:rFonts w:ascii="Times New Roman" w:hAnsi="Times New Roman" w:cs="Times New Roman"/>
+        </w:rPr>
+      </w:pPr>
+      <w:r>
+        <w:rPr>
+          <w:rFonts w:ascii="Times New Roman" w:hAnsi="Times New Roman" w:cs="Times New Roman"/>
+        </w:rPr>
+        <w:t xml:space="preserve">An optional UAV flies over the mission area at 20 m/s and, every tick, records each enemy within its 180 m downward detection radius, with a time stamp, in an intelligence store shared with the ground planner. Every stored sighting adds a penalty to the road edges around it that fades with the age Δt of the sighting while its radius grows to cover where the enemy could have moved since:</w:t>
+      </w:r>
+    </w:p>
+    <w:p>
+      <w:pPr>
+        <w:spacing w:after="80"/>
+        <w:jc w:val="both"/>
+        <w:rPr>
+          <w:rFonts w:ascii="Times New Roman" w:hAnsi="Times New Roman" w:cs="Times New Roman"/>
+        </w:rPr>
+      </w:pPr>
+      <m:oMathPara>
+        <m:oMath>
+          <m:r>
+            <w:rPr>
+              <w:rFonts w:ascii="Cambria Math" w:hAnsi="Cambria Math" w:cs="Times New Roman"/>
+            </w:rPr>
+            <m:t xml:space="preserve">W</m:t>
+          </m:r>
+          <m:d>
+            <m:dPr>
+              <m:ctrlPr>
+                <w:rPr>
+                  <w:rFonts w:ascii="Cambria Math" w:hAnsi="Cambria Math" w:cs="Times New Roman"/>
+                  <w:i/>
+                </w:rPr>
+              </m:ctrlPr>
+            </m:dPr>
+            <m:e>
+              <m:r>
+                <w:rPr>
+                  <w:rFonts w:ascii="Cambria Math" w:hAnsi="Cambria Math" w:cs="Times New Roman"/>
+                </w:rPr>
+                <m:t xml:space="preserve">d, Δt</m:t>
+              </m:r>
+            </m:e>
+          </m:d>
+          <m:r>
+            <w:rPr>
+              <w:rFonts w:ascii="Cambria Math" w:hAnsi="Cambria Math" w:cs="Times New Roman"/>
+            </w:rPr>
+            <m:t xml:space="preserve">=</m:t>
+          </m:r>
+          <m:sSub>
+            <m:sSubPr>
+              <m:ctrlPr>
+                <w:rPr>
+                  <w:rFonts w:ascii="Cambria Math" w:hAnsi="Cambria Math" w:cs="Times New Roman"/>
+                  <w:i/>
+                </w:rPr>
+              </m:ctrlPr>
+            </m:sSubPr>
+            <m:e>
+              <m:r>
+                <w:rPr>
+                  <w:rFonts w:ascii="Cambria Math" w:hAnsi="Cambria Math" w:cs="Times New Roman"/>
+                </w:rPr>
+                <m:t xml:space="preserve">W</m:t>
+              </m:r>
+            </m:e>
+            <m:sub>
+              <m:r>
+                <m:rPr>
+                  <m:sty m:val="p"/>
+                </m:rPr>
+                <w:rPr>
+                  <w:rFonts w:ascii="Cambria Math" w:hAnsi="Cambria Math" w:cs="Times New Roman"/>
+                </w:rPr>
+                <m:t xml:space="preserve">base</m:t>
+              </m:r>
+            </m:sub>
+          </m:sSub>
+          <m:r>
+            <w:rPr>
+              <w:rFonts w:ascii="Cambria Math" w:hAnsi="Cambria Math" w:cs="Times New Roman"/>
+            </w:rPr>
+            <m:t xml:space="preserve">·</m:t>
+          </m:r>
+          <m:sSup>
+            <m:sSupPr>
+              <m:ctrlPr>
+                <w:rPr>
+                  <w:rFonts w:ascii="Cambria Math" w:hAnsi="Cambria Math" w:cs="Times New Roman"/>
+                  <w:i/>
+                </w:rPr>
+              </m:ctrlPr>
+            </m:sSupPr>
+            <m:e>
+              <m:r>
+                <w:rPr>
+                  <w:rFonts w:ascii="Cambria Math" w:hAnsi="Cambria Math" w:cs="Times New Roman"/>
+                </w:rPr>
+                <m:t xml:space="preserve">e</m:t>
+              </m:r>
+            </m:e>
+            <m:sup>
+              <m:r>
+                <w:rPr>
+                  <w:rFonts w:ascii="Cambria Math" w:hAnsi="Cambria Math" w:cs="Times New Roman"/>
+                </w:rPr>
+                <m:t xml:space="preserve">−Δt/τ</m:t>
+              </m:r>
+            </m:sup>
+          </m:sSup>
+          <m:r>
+            <w:rPr>
+              <w:rFonts w:ascii="Cambria Math" w:hAnsi="Cambria Math" w:cs="Times New Roman"/>
+            </w:rPr>
+            <m:t xml:space="preserve">·</m:t>
+          </m:r>
+          <m:func>
+            <m:funcPr>
+              <m:ctrlPr>
+                <w:rPr>
+                  <w:rFonts w:ascii="Cambria Math" w:hAnsi="Cambria Math" w:cs="Times New Roman"/>
+                  <w:i/>
+                </w:rPr>
+              </m:ctrlPr>
+            </m:funcPr>
+            <m:fName>
+              <m:r>
+                <m:rPr>
+                  <m:sty m:val="p"/>
+                </m:rPr>
+                <w:rPr>
+                  <w:rFonts w:ascii="Cambria Math" w:hAnsi="Cambria Math" w:cs="Times New Roman"/>
+                </w:rPr>
+                <m:t xml:space="preserve">max</m:t>
+              </m:r>
+            </m:fName>
+            <m:e>
+              <m:d>
+                <m:dPr>
+                  <m:ctrlPr>
+                    <w:rPr>
+                      <w:rFonts w:ascii="Cambria Math" w:hAnsi="Cambria Math" w:cs="Times New Roman"/>
+                      <w:i/>
+                    </w:rPr>
+                  </m:ctrlPr>
+                </m:dPr>
+                <m:e>
+                  <m:r>
+                    <w:rPr>
+                      <w:rFonts w:ascii="Cambria Math" w:hAnsi="Cambria Math" w:cs="Times New Roman"/>
+                    </w:rPr>
+                    <m:t xml:space="preserve">0, 1−</m:t>
+                  </m:r>
+                  <m:f>
+                    <m:fPr>
+                      <m:ctrlPr>
+                        <w:rPr>
+                          <w:rFonts w:ascii="Cambria Math" w:hAnsi="Cambria Math" w:cs="Times New Roman"/>
+                          <w:i/>
+                        </w:rPr>
+                      </m:ctrlPr>
+                    </m:fPr>
+                    <m:num>
+                      <m:r>
+                        <w:rPr>
+                          <w:rFonts w:ascii="Cambria Math" w:hAnsi="Cambria Math" w:cs="Times New Roman"/>
+                        </w:rPr>
+                        <m:t xml:space="preserve">d</m:t>
+                      </m:r>
+                    </m:num>
+                    <m:den>
+                      <m:r>
+                        <w:rPr>
+                          <w:rFonts w:ascii="Cambria Math" w:hAnsi="Cambria Math" w:cs="Times New Roman"/>
+                        </w:rPr>
+                        <m:t xml:space="preserve">r</m:t>
+                      </m:r>
+                      <m:d>
+                        <m:dPr>
+                          <m:ctrlPr>
+                            <w:rPr>
+                              <w:rFonts w:ascii="Cambria Math" w:hAnsi="Cambria Math" w:cs="Times New Roman"/>
+                              <w:i/>
+                            </w:rPr>
+                          </m:ctrlPr>
+                        </m:dPr>
+                        <m:e>
+                          <m:r>
+                            <w:rPr>
+                              <w:rFonts w:ascii="Cambria Math" w:hAnsi="Cambria Math" w:cs="Times New Roman"/>
+                            </w:rPr>
+                            <m:t xml:space="preserve">Δt</m:t>
+                          </m:r>
+                        </m:e>
+                      </m:d>
+                    </m:den>
+                  </m:f>
+                </m:e>
+              </m:d>
+            </m:e>
+          </m:func>
+          <m:r>
+            <w:rPr>
+              <w:rFonts w:ascii="Cambria Math" w:hAnsi="Cambria Math" w:cs="Times New Roman"/>
+            </w:rPr>
+            <m:t xml:space="preserve">,     </m:t>
+          </m:r>
+          <m:r>
+            <w:rPr>
+              <w:rFonts w:ascii="Cambria Math" w:hAnsi="Cambria Math" w:cs="Times New Roman"/>
+            </w:rPr>
+            <m:t xml:space="preserve">r</m:t>
+          </m:r>
+          <m:d>
+            <m:dPr>
+              <m:ctrlPr>
+                <w:rPr>
+                  <w:rFonts w:ascii="Cambria Math" w:hAnsi="Cambria Math" w:cs="Times New Roman"/>
+                  <w:i/>
+                </w:rPr>
+              </m:ctrlPr>
+            </m:dPr>
+            <m:e>
+              <m:r>
+                <w:rPr>
+                  <w:rFonts w:ascii="Cambria Math" w:hAnsi="Cambria Math" w:cs="Times New Roman"/>
+                </w:rPr>
+                <m:t xml:space="preserve">Δt</m:t>
+              </m:r>
+            </m:e>
+          </m:d>
+          <m:r>
+            <w:rPr>
+              <w:rFonts w:ascii="Cambria Math" w:hAnsi="Cambria Math" w:cs="Times New Roman"/>
+            </w:rPr>
+            <m:t xml:space="preserve">=</m:t>
+          </m:r>
+          <m:func>
+            <m:funcPr>
+              <m:ctrlPr>
+                <w:rPr>
+                  <w:rFonts w:ascii="Cambria Math" w:hAnsi="Cambria Math" w:cs="Times New Roman"/>
+                  <w:i/>
+                </w:rPr>
+              </m:ctrlPr>
+            </m:funcPr>
+            <m:fName>
+              <m:r>
+                <m:rPr>
+                  <m:sty m:val="p"/>
+                </m:rPr>
+                <w:rPr>
+                  <w:rFonts w:ascii="Cambria Math" w:hAnsi="Cambria Math" w:cs="Times New Roman"/>
+                </w:rPr>
+                <m:t xml:space="preserve">max</m:t>
+              </m:r>
+            </m:fName>
+            <m:e>
+              <m:d>
+                <m:dPr>
+                  <m:ctrlPr>
+                    <w:rPr>
+                      <w:rFonts w:ascii="Cambria Math" w:hAnsi="Cambria Math" w:cs="Times New Roman"/>
+                      <w:i/>
+                    </w:rPr>
+                  </m:ctrlPr>
+                </m:dPr>
+                <m:e>
+                  <m:sSub>
+                    <m:sSubPr>
+                      <m:ctrlPr>
+                        <w:rPr>
+                          <w:rFonts w:ascii="Cambria Math" w:hAnsi="Cambria Math" w:cs="Times New Roman"/>
+                          <w:i/>
+                        </w:rPr>
+                      </m:ctrlPr>
+                    </m:sSubPr>
+                    <m:e>
+                      <m:r>
+                        <w:rPr>
+                          <w:rFonts w:ascii="Cambria Math" w:hAnsi="Cambria Math" w:cs="Times New Roman"/>
+                        </w:rPr>
+                        <m:t xml:space="preserve">r</m:t>
+                      </m:r>
+                    </m:e>
+                    <m:sub>
+                      <m:r>
+                        <m:rPr>
+                          <m:sty m:val="p"/>
+                        </m:rPr>
+                        <w:rPr>
+                          <w:rFonts w:ascii="Cambria Math" w:hAnsi="Cambria Math" w:cs="Times New Roman"/>
+                        </w:rPr>
+                        <m:t xml:space="preserve">min</m:t>
+                      </m:r>
+                    </m:sub>
+                  </m:sSub>
+                  <m:r>
+                    <w:rPr>
+                      <w:rFonts w:ascii="Cambria Math" w:hAnsi="Cambria Math" w:cs="Times New Roman"/>
+                    </w:rPr>
+                    <m:t xml:space="preserve">, v·Δt</m:t>
+                  </m:r>
+                </m:e>
+              </m:d>
+            </m:e>
+          </m:func>
+        </m:oMath>
+      </m:oMathPara>
+    </w:p>
+    <w:p>
+      <w:pPr>
+        <w:spacing w:after="80"/>
+        <w:jc w:val="both"/>
+        <w:rPr>
+          <w:rFonts w:ascii="Times New Roman" w:hAnsi="Times New Roman" w:cs="Times New Roman"/>
+        </w:rPr>
+      </w:pPr>
+      <w:r>
+        <w:rPr>
+          <w:rFonts w:ascii="Times New Roman" w:hAnsi="Times New Roman" w:cs="Times New Roman"/>
+        </w:rPr>
+        <w:t xml:space="preserve">with W</w:t>
+      </w:r>
+      <w:r>
+        <w:rPr>
+          <w:rFonts w:ascii="Times New Roman" w:hAnsi="Times New Roman" w:cs="Times New Roman"/>
+          <w:vertAlign w:val="subscript"/>
+        </w:rPr>
+        <w:t xml:space="preserve">base</w:t>
+      </w:r>
+      <w:r>
+        <w:rPr>
+          <w:rFonts w:ascii="Times New Roman" w:hAnsi="Times New Roman" w:cs="Times New Roman"/>
+        </w:rPr>
+        <w:t xml:space="preserve"> = 1200, τ = 30 ticks, r</w:t>
+      </w:r>
+      <w:r>
+        <w:rPr>
+          <w:rFonts w:ascii="Times New Roman" w:hAnsi="Times New Roman" w:cs="Times New Roman"/>
+          <w:vertAlign w:val="subscript"/>
+        </w:rPr>
+        <w:t xml:space="preserve">min</w:t>
+      </w:r>
+      <w:r>
+        <w:rPr>
+          <w:rFonts w:ascii="Times New Roman" w:hAnsi="Times New Roman" w:cs="Times New Roman"/>
+        </w:rPr>
+        <w:t xml:space="preserve"> = 60 m and v = 3 m per tick; d is the distance from the edge midpoint to the sighting, and sightings older than 90 ticks (below 5% strength) are dropped. Four coverage strategies are implemented: lawnmower (parallel strips 243 m apart), threat-informed (revisit the stalest sighting), target-informed (hover between the agent and the remaining targets) and hybrid (a repeating 150-tick cycle of the two informed modes). The strategy is set with the uav_strategy request parameter, and the live monitor shows the UAV and its sightings.</w:t>
+      </w:r>
+    </w:p>
+    <w:p>
+      <w:pPr>
+        <w:keepNext/>
+        <w:spacing w:before="60" w:after="0"/>
+        <w:jc w:val="center"/>
+      </w:pPr>
+      <w:r>
+        <w:rPr>
+          <w:noProof/>
+        </w:rPr>
+        <w:drawing>
+          <wp:inline distT="0" distB="0" distL="0" distR="0">
+            <wp:extent cx="2926080" cy="1480409"/>
+            <wp:effectExtent l="0" t="0" r="0" b="0"/>
+            <wp:docPr id="1902611001" name="UAV overlay screenshot"/>
+            <wp:cNvGraphicFramePr>
+              <a:graphicFrameLocks xmlns:a="http://schemas.openxmlformats.org/drawingml/2006/main" noChangeAspect="1"/>
+            </wp:cNvGraphicFramePr>
+            <a:graphic xmlns:a="http://schemas.openxmlformats.org/drawingml/2006/main">
+              <a:graphicData uri="http://schemas.openxmlformats.org/drawingml/2006/picture">
+                <pic:pic xmlns:pic="http://schemas.openxmlformats.org/drawingml/2006/picture">
+                  <pic:nvPicPr>
+                    <pic:cNvPr id="0" name="image6.png"/>
+                    <pic:cNvPicPr/>
+                  </pic:nvPicPr>
+                  <pic:blipFill>
+                    <a:blip r:embed="rId15"/>
+                    <a:stretch>
+                      <a:fillRect/>
+                    </a:stretch>
+                  </pic:blipFill>
+                  <pic:spPr>
+                    <a:xfrm>
+                      <a:off x="0" y="0"/>
+                      <a:ext cx="2926080" cy="1480409"/>
+                    </a:xfrm>
+                    <a:prstGeom prst="rect">
+                      <a:avLst/>
+                    </a:prstGeom>
+                  </pic:spPr>
+                </pic:pic>
+              </a:graphicData>
+            </a:graphic>
+          </wp:inline>
+        </w:drawing>
+      </w:r>
+    </w:p>
+    <w:p>
+      <w:pPr>
+        <w:pStyle w:val="Caption"/>
+        <w:spacing w:after="120"/>
+        <w:jc w:val="center"/>
+        <w:rPr>
+          <w:rFonts w:ascii="Times New Roman" w:hAnsi="Times New Roman" w:cs="Times New Roman"/>
+          <w:sz w:val="20"/>
+          <w:szCs w:val="20"/>
+        </w:rPr>
+      </w:pPr>
+      <w:r>
+        <w:rPr>
+          <w:rFonts w:ascii="Times New Roman" w:hAnsi="Times New Roman" w:cs="Times New Roman"/>
+          <w:sz w:val="20"/>
+          <w:szCs w:val="20"/>
+        </w:rPr>
+        <w:t xml:space="preserve">Figure </w:t>
+      </w:r>
+      <w:r>
+        <w:rPr>
+          <w:rFonts w:ascii="Times New Roman" w:hAnsi="Times New Roman" w:cs="Times New Roman"/>
+          <w:sz w:val="20"/>
+          <w:szCs w:val="20"/>
+        </w:rPr>
+        <w:fldChar w:fldCharType="begin"/>
+      </w:r>
+      <w:r>
+        <w:rPr>
+          <w:rFonts w:ascii="Times New Roman" w:hAnsi="Times New Roman" w:cs="Times New Roman"/>
+          <w:sz w:val="20"/>
+          <w:szCs w:val="20"/>
+        </w:rPr>
+        <w:instrText xml:space="preserve"> SEQ Figure \* ARABIC </w:instrText>
+      </w:r>
+      <w:r>
+        <w:rPr>
+          <w:rFonts w:ascii="Times New Roman" w:hAnsi="Times New Roman" w:cs="Times New Roman"/>
+          <w:sz w:val="20"/>
+          <w:szCs w:val="20"/>
+        </w:rPr>
+        <w:fldChar w:fldCharType="separate"/>
+      </w:r>
+      <w:r>
+        <w:rPr>
+          <w:rFonts w:ascii="Times New Roman" w:hAnsi="Times New Roman" w:cs="Times New Roman"/>
+          <w:noProof/>
+          <w:sz w:val="20"/>
+          <w:szCs w:val="20"/>
+        </w:rPr>
+        <w:t>1</w:t>
+      </w:r>
+      <w:r>
+        <w:rPr>
+          <w:rFonts w:ascii="Times New Roman" w:hAnsi="Times New Roman" w:cs="Times New Roman"/>
+          <w:sz w:val="20"/>
+          <w:szCs w:val="20"/>
+        </w:rPr>
+        <w:fldChar w:fldCharType="end"/>
+      </w:r>
+      <w:r>
+        <w:rPr>
+          <w:rFonts w:ascii="Times New Roman" w:hAnsi="Times New Roman" w:cs="Times New Roman"/>
+          <w:sz w:val="20"/>
+          <w:szCs w:val="20"/>
+        </w:rPr>
+        <w:t xml:space="preserve"> UAV with its 180 m detection ring above the ground agent (blue) in the 3-D live monitor</w:t>
+      </w:r>
+    </w:p>
+    <w:p>
+      <w:pPr>
+        <w:pStyle w:val="Heading1"/>
+        <w:pBdr>
+          <w:bottom w:val="single" w:sz="4" w:space="1" w:color="auto"/>
+        </w:pBdr>
+        <w:rPr>
+          <w:rFonts w:ascii="Times New Roman" w:hAnsi="Times New Roman" w:cs="Times New Roman"/>
+          <w:color w:val="000000" w:themeColor="text1"/>
+        </w:rPr>
+      </w:pPr>
+      <w:r>
+        <w:rPr>
+          <w:rFonts w:ascii="Times New Roman" w:hAnsi="Times New Roman" w:cs="Times New Roman"/>
+          <w:color w:val="000000" w:themeColor="text1"/>
+        </w:rPr>
+        <w:t>5.  Scoring &amp; Mission Outcomes</w:t>
       </w:r>
     </w:p>
     <w:p>
@@ -1965,7 +2071,7 @@
         <w:rPr>
           <w:rFonts w:ascii="Times New Roman" w:hAnsi="Times New Roman" w:cs="Times New Roman"/>
         </w:rPr>
-        <w:t>Motorway and primary roads carry zero terrain penalty; footpaths and tracks incur −3 per segment. Missions are classified as SUCCESS (all targets), PARTIAL (≥70% collected at game-over), or FAILED (&lt;70%). Every completed mission is saved as a timestamped JSON file for longitudinal comparison.</w:t>
+        <w:t>Motorway to secondary roads carry no terrain penalty, minor and residential roads −1 and footpaths and tracks −3 per segment. A mission is a SUCCESS when all targets are collected; when the last agent is caught it is PARTIAL if more than 70% of the targets were collected and FAILED otherwise. Successful and partial missions are saved as timestamped JSON files.</w:t>
       </w:r>
     </w:p>
     <w:p>
@@ -1984,7 +2090,7 @@
           <w:rFonts w:ascii="Times New Roman" w:hAnsi="Times New Roman" w:cs="Times New Roman"/>
           <w:color w:val="000000" w:themeColor="text1"/>
         </w:rPr>
-        <w:t>5.  Running a Mission</w:t>
+        <w:t>6.  Running a Mission</w:t>
       </w:r>
     </w:p>
     <w:p>
@@ -1998,7 +2104,7 @@
         <w:rPr>
           <w:rFonts w:ascii="Times New Roman" w:hAnsi="Times New Roman" w:cs="Times New Roman"/>
         </w:rPr>
-        <w:t>Open the Mission Planner (index.html) in a browser and enter any city name and radius.</w:t>
+        <w:t>Open the Mission Planner (index.html) and pick the centre and radius.</w:t>
       </w:r>
     </w:p>
     <w:p>
@@ -2027,10 +2133,9 @@
         <w:rPr>
           <w:rFonts w:ascii="Times New Roman" w:hAnsi="Times New Roman" w:cs="Times New Roman"/>
         </w:rPr>
-        <w:t>Set agent count (1–4), simulation speed (0.25× – 100×), and press Deploy Mission.</w:t>
-      </w:r>
-    </w:p>
-    <w:bookmarkEnd w:id="0"/>
+        <w:t>Set the agent count (1–4) and threat parameters, then press Deploy Mission.</w:t>
+      </w:r>
+    </w:p>
     <w:p>
       <w:pPr>
         <w:spacing w:after="40"/>
@@ -2042,7 +2147,7 @@
         <w:rPr>
           <w:rFonts w:ascii="Times New Roman" w:hAnsi="Times New Roman" w:cs="Times New Roman"/>
         </w:rPr>
-        <w:t>Monitor live agent positions, score, and escape events on the Live Monitor (mission.html).</w:t>
+        <w:t>Follow it on the 3-D Live Monitor (mission.html) and the robot Dashboard.</w:t>
       </w:r>
     </w:p>
     <w:p>
@@ -2104,26 +2209,15 @@
                             </w:pPr>
                             <w:r>
                               <w:t xml:space="preserve">Figure </w:t>
-                            </w:r>
-                            <w:r>
                               <w:fldChar w:fldCharType="begin"/>
-                            </w:r>
-                            <w:r>
                               <w:instrText xml:space="preserve"> SEQ Figure \* ARABIC </w:instrText>
-                            </w:r>
-                            <w:r>
                               <w:fldChar w:fldCharType="separate"/>
                             </w:r>
                             <w:r>
                               <w:rPr>
                                 <w:noProof/>
                               </w:rPr>
-                              <w:t>1</w:t>
-                            </w:r>
-                            <w:r>
-                              <w:rPr>
-                                <w:noProof/>
-                              </w:rPr>
+                              <w:t>2</w:t>
                               <w:fldChar w:fldCharType="end"/>
                             </w:r>
                             <w:r>
@@ -2176,7 +2270,7 @@
                           <w:rPr>
                             <w:noProof/>
                           </w:rPr>
-                          <w:t>1</w:t>
+                          <w:t>2</w:t>
                         </w:r>
                       </w:fldSimple>
                       <w:r>
@@ -2273,11 +2367,6 @@
             </wp14:sizeRelV>
           </wp:anchor>
         </w:drawing>
-      </w:r>
-      <w:r>
-        <w:rPr>
-          <w:noProof/>
-        </w:rPr>
         <w:drawing>
           <wp:anchor distT="0" distB="0" distL="114300" distR="114300" simplePos="0" relativeHeight="251661312" behindDoc="0" locked="0" layoutInCell="1" allowOverlap="1" wp14:anchorId="1224FACD" wp14:editId="6A337BE5">
             <wp:simplePos x="0" y="0"/>
@@ -2333,11 +2422,6 @@
             </wp14:sizeRelV>
           </wp:anchor>
         </w:drawing>
-      </w:r>
-      <w:r>
-        <w:rPr>
-          <w:noProof/>
-        </w:rPr>
         <w:drawing>
           <wp:anchor distT="0" distB="0" distL="114300" distR="114300" simplePos="0" relativeHeight="251660288" behindDoc="0" locked="0" layoutInCell="1" allowOverlap="1" wp14:anchorId="64CEBBCF" wp14:editId="6FD219C5">
             <wp:simplePos x="0" y="0"/>
@@ -2395,7 +2479,7 @@
         <w:rPr>
           <w:rFonts w:ascii="Times New Roman" w:hAnsi="Times New Roman" w:cs="Times New Roman"/>
         </w:rPr>
-        <w:t>Press Restart to replay the identical spawn configuration with different parameters.</w:t>
+        <w:t>Press Restart to replay the identical spawn configuration.</w:t>
       </w:r>
     </w:p>
     <w:p>
@@ -2410,19 +2494,7 @@
         <w:rPr>
           <w:noProof/>
         </w:rPr>
-        <w:t xml:space="preserve"> </w:t>
-      </w:r>
-      <w:r>
-        <w:rPr>
-          <w:noProof/>
-        </w:rPr>
-        <w:t xml:space="preserve"> </w:t>
-      </w:r>
-      <w:r>
-        <w:rPr>
-          <w:noProof/>
-        </w:rPr>
-        <w:t xml:space="preserve"> </w:t>
+        <w:t xml:space="preserve">   </w:t>
       </w:r>
     </w:p>
     <w:p>
@@ -2499,14 +2571,8 @@
                             </w:pPr>
                             <w:r>
                               <w:t xml:space="preserve">Figure </w:t>
-                            </w:r>
-                            <w:r>
                               <w:fldChar w:fldCharType="begin"/>
-                            </w:r>
-                            <w:r>
                               <w:instrText xml:space="preserve"> SEQ Figure \* ARABIC </w:instrText>
-                            </w:r>
-                            <w:r>
                               <w:fldChar w:fldCharType="separate"/>
                             </w:r>
                             <w:r>
@@ -2514,11 +2580,6 @@
                                 <w:noProof/>
                               </w:rPr>
                               <w:t>3</w:t>
-                            </w:r>
-                            <w:r>
-                              <w:rPr>
-                                <w:noProof/>
-                              </w:rPr>
                               <w:fldChar w:fldCharType="end"/>
                             </w:r>
                             <w:r>
@@ -2636,26 +2697,15 @@
                             </w:pPr>
                             <w:r>
                               <w:t xml:space="preserve">Figure </w:t>
-                            </w:r>
-                            <w:r>
                               <w:fldChar w:fldCharType="begin"/>
-                            </w:r>
-                            <w:r>
                               <w:instrText xml:space="preserve"> SEQ Figure \* ARABIC </w:instrText>
-                            </w:r>
-                            <w:r>
                               <w:fldChar w:fldCharType="separate"/>
                             </w:r>
                             <w:r>
                               <w:rPr>
                                 <w:noProof/>
                               </w:rPr>
-                              <w:t>2</w:t>
-                            </w:r>
-                            <w:r>
-                              <w:rPr>
-                                <w:noProof/>
-                              </w:rPr>
+                              <w:t>4</w:t>
                               <w:fldChar w:fldCharType="end"/>
                             </w:r>
                             <w:r>
@@ -2704,7 +2754,7 @@
                           <w:rPr>
                             <w:noProof/>
                           </w:rPr>
-                          <w:t>2</w:t>
+                          <w:t>4</w:t>
                         </w:r>
                       </w:fldSimple>
                       <w:r>
@@ -2718,11 +2768,6 @@
             </w:pict>
           </mc:Fallback>
         </mc:AlternateContent>
-      </w:r>
-      <w:r>
-        <w:rPr>
-          <w:noProof/>
-        </w:rPr>
         <mc:AlternateContent>
           <mc:Choice Requires="wps">
             <w:drawing>
@@ -2771,26 +2816,15 @@
                             </w:pPr>
                             <w:r>
                               <w:t xml:space="preserve">Figure </w:t>
-                            </w:r>
-                            <w:r>
                               <w:fldChar w:fldCharType="begin"/>
-                            </w:r>
-                            <w:r>
                               <w:instrText xml:space="preserve"> SEQ Figure \* ARABIC </w:instrText>
-                            </w:r>
-                            <w:r>
                               <w:fldChar w:fldCharType="separate"/>
                             </w:r>
                             <w:r>
                               <w:rPr>
                                 <w:noProof/>
                               </w:rPr>
-                              <w:t>4</w:t>
-                            </w:r>
-                            <w:r>
-                              <w:rPr>
-                                <w:noProof/>
-                              </w:rPr>
+                              <w:t>5</w:t>
                               <w:fldChar w:fldCharType="end"/>
                             </w:r>
                             <w:r>
@@ -2839,7 +2873,7 @@
                           <w:rPr>
                             <w:noProof/>
                           </w:rPr>
-                          <w:t>4</w:t>
+                          <w:t>5</w:t>
                         </w:r>
                       </w:fldSimple>
                       <w:r>
@@ -2871,7 +2905,1117 @@
           <w:rFonts w:ascii="Times New Roman" w:hAnsi="Times New Roman" w:cs="Times New Roman"/>
           <w:color w:val="000000" w:themeColor="text1"/>
         </w:rPr>
-        <w:t>6.  Planned Improvements</w:t>
+        <w:t xml:space="preserve">7.  Evaluation: UAV Strategy Study</w:t>
+      </w:r>
+    </w:p>
+    <w:p>
+      <w:pPr>
+        <w:spacing w:after="120"/>
+        <w:jc w:val="both"/>
+        <w:rPr>
+          <w:rFonts w:ascii="Times New Roman" w:hAnsi="Times New Roman" w:cs="Times New Roman"/>
+        </w:rPr>
+      </w:pPr>
+      <w:r>
+        <w:rPr>
+          <w:rFonts w:ascii="Times New Roman" w:hAnsi="Times New Roman" w:cs="Times New Roman"/>
+        </w:rPr>
+        <w:t xml:space="preserve">In July 2026 the headless batch harness (evaluation/) ran a 2 × 5 study: two enemy densities (standard V1 ≈ 1.5 and stress V2 ≈ 3.9 per km²) × the no-UAV baseline and four UAV strategies, 30 single-agent missions per cell at 4× speed on central Athens. The Mission Performance Index (MPI) weights the outcome (0.5), escape decisions (0.3) and mission time (0.2).</w:t>
+      </w:r>
+    </w:p>
+    <w:tbl>
+      <w:tblPr>
+        <w:tblW w:w="8100" w:type="dxa"/>
+        <w:jc w:val="center"/>
+        <w:tblBorders>
+          <w:top w:val="single" w:sz="4" w:space="0" w:color="auto"/>
+          <w:left w:val="single" w:sz="4" w:space="0" w:color="auto"/>
+          <w:bottom w:val="single" w:sz="4" w:space="0" w:color="auto"/>
+          <w:right w:val="single" w:sz="4" w:space="0" w:color="auto"/>
+          <w:insideH w:val="single" w:sz="4" w:space="0" w:color="auto"/>
+          <w:insideV w:val="single" w:sz="4" w:space="0" w:color="auto"/>
+        </w:tblBorders>
+        <w:tblCellMar>
+          <w:left w:w="10" w:type="dxa"/>
+          <w:right w:w="10" w:type="dxa"/>
+        </w:tblCellMar>
+        <w:tblLook w:val="04A0" w:firstRow="1" w:lastRow="0" w:firstColumn="1" w:lastColumn="0" w:noHBand="0" w:noVBand="1"/>
+      </w:tblPr>
+      <w:tblGrid>
+        <w:gridCol w:w="2300"/>
+        <w:gridCol w:w="1450"/>
+        <w:gridCol w:w="1450"/>
+        <w:gridCol w:w="1450"/>
+        <w:gridCol w:w="1450"/>
+      </w:tblGrid>
+      <w:tr>
+        <w:trPr>
+          <w:jc w:val="center"/>
+        </w:trPr>
+        <w:tc>
+          <w:tcPr>
+            <w:tcW w:w="2300" w:type="dxa"/>
+            <w:tcBorders>
+              <w:top w:val="single" w:sz="1" w:space="0" w:color="BBBBBB"/>
+              <w:left w:val="single" w:sz="1" w:space="0" w:color="BBBBBB"/>
+              <w:bottom w:val="single" w:sz="1" w:space="0" w:color="BBBBBB"/>
+              <w:right w:val="single" w:sz="1" w:space="0" w:color="BBBBBB"/>
+            </w:tcBorders>
+            <w:shd w:val="clear" w:color="auto" w:fill="DCE6F1"/>
+            <w:tcMar>
+              <w:top w:w="60" w:type="dxa"/>
+              <w:left w:w="100" w:type="dxa"/>
+              <w:bottom w:w="60" w:type="dxa"/>
+              <w:right w:w="100" w:type="dxa"/>
+            </w:tcMar>
+          </w:tcPr>
+          <w:p>
+            <w:pPr>
+              <w:jc w:val="center"/>
+              <w:rPr>
+                <w:rFonts w:ascii="Times New Roman" w:hAnsi="Times New Roman" w:cs="Times New Roman"/>
+              </w:rPr>
+            </w:pPr>
+            <w:r>
+              <w:rPr>
+                <w:rFonts w:ascii="Times New Roman" w:hAnsi="Times New Roman" w:cs="Times New Roman"/>
+                <w:b/>
+                <w:bCs/>
+                <w:sz w:val="18"/>
+                <w:szCs w:val="18"/>
+              </w:rPr>
+              <w:t xml:space="preserve">Condition</w:t>
+            </w:r>
+          </w:p>
+        </w:tc>
+        <w:tc>
+          <w:tcPr>
+            <w:tcW w:w="1450" w:type="dxa"/>
+            <w:tcBorders>
+              <w:top w:val="single" w:sz="1" w:space="0" w:color="BBBBBB"/>
+              <w:left w:val="single" w:sz="1" w:space="0" w:color="BBBBBB"/>
+              <w:bottom w:val="single" w:sz="1" w:space="0" w:color="BBBBBB"/>
+              <w:right w:val="single" w:sz="1" w:space="0" w:color="BBBBBB"/>
+            </w:tcBorders>
+            <w:shd w:val="clear" w:color="auto" w:fill="DCE6F1"/>
+            <w:tcMar>
+              <w:top w:w="60" w:type="dxa"/>
+              <w:left w:w="100" w:type="dxa"/>
+              <w:bottom w:w="60" w:type="dxa"/>
+              <w:right w:w="100" w:type="dxa"/>
+            </w:tcMar>
+          </w:tcPr>
+          <w:p>
+            <w:pPr>
+              <w:jc w:val="center"/>
+              <w:rPr>
+                <w:rFonts w:ascii="Times New Roman" w:hAnsi="Times New Roman" w:cs="Times New Roman"/>
+              </w:rPr>
+            </w:pPr>
+            <w:r>
+              <w:rPr>
+                <w:rFonts w:ascii="Times New Roman" w:hAnsi="Times New Roman" w:cs="Times New Roman"/>
+                <w:b/>
+                <w:bCs/>
+                <w:sz w:val="18"/>
+                <w:szCs w:val="18"/>
+              </w:rPr>
+              <w:t xml:space="preserve">V1 success</w:t>
+            </w:r>
+          </w:p>
+        </w:tc>
+        <w:tc>
+          <w:tcPr>
+            <w:tcW w:w="1450" w:type="dxa"/>
+            <w:tcBorders>
+              <w:top w:val="single" w:sz="1" w:space="0" w:color="BBBBBB"/>
+              <w:left w:val="single" w:sz="1" w:space="0" w:color="BBBBBB"/>
+              <w:bottom w:val="single" w:sz="1" w:space="0" w:color="BBBBBB"/>
+              <w:right w:val="single" w:sz="1" w:space="0" w:color="BBBBBB"/>
+            </w:tcBorders>
+            <w:shd w:val="clear" w:color="auto" w:fill="DCE6F1"/>
+            <w:tcMar>
+              <w:top w:w="60" w:type="dxa"/>
+              <w:left w:w="100" w:type="dxa"/>
+              <w:bottom w:w="60" w:type="dxa"/>
+              <w:right w:w="100" w:type="dxa"/>
+            </w:tcMar>
+          </w:tcPr>
+          <w:p>
+            <w:pPr>
+              <w:jc w:val="center"/>
+              <w:rPr>
+                <w:rFonts w:ascii="Times New Roman" w:hAnsi="Times New Roman" w:cs="Times New Roman"/>
+              </w:rPr>
+            </w:pPr>
+            <w:r>
+              <w:rPr>
+                <w:rFonts w:ascii="Times New Roman" w:hAnsi="Times New Roman" w:cs="Times New Roman"/>
+                <w:b/>
+                <w:bCs/>
+                <w:sz w:val="18"/>
+                <w:szCs w:val="18"/>
+              </w:rPr>
+              <w:t xml:space="preserve">V1 MPI</w:t>
+            </w:r>
+          </w:p>
+        </w:tc>
+        <w:tc>
+          <w:tcPr>
+            <w:tcW w:w="1450" w:type="dxa"/>
+            <w:tcBorders>
+              <w:top w:val="single" w:sz="1" w:space="0" w:color="BBBBBB"/>
+              <w:left w:val="single" w:sz="1" w:space="0" w:color="BBBBBB"/>
+              <w:bottom w:val="single" w:sz="1" w:space="0" w:color="BBBBBB"/>
+              <w:right w:val="single" w:sz="1" w:space="0" w:color="BBBBBB"/>
+            </w:tcBorders>
+            <w:shd w:val="clear" w:color="auto" w:fill="DCE6F1"/>
+            <w:tcMar>
+              <w:top w:w="60" w:type="dxa"/>
+              <w:left w:w="100" w:type="dxa"/>
+              <w:bottom w:w="60" w:type="dxa"/>
+              <w:right w:w="100" w:type="dxa"/>
+            </w:tcMar>
+          </w:tcPr>
+          <w:p>
+            <w:pPr>
+              <w:jc w:val="center"/>
+              <w:rPr>
+                <w:rFonts w:ascii="Times New Roman" w:hAnsi="Times New Roman" w:cs="Times New Roman"/>
+              </w:rPr>
+            </w:pPr>
+            <w:r>
+              <w:rPr>
+                <w:rFonts w:ascii="Times New Roman" w:hAnsi="Times New Roman" w:cs="Times New Roman"/>
+                <w:b/>
+                <w:bCs/>
+                <w:sz w:val="18"/>
+                <w:szCs w:val="18"/>
+              </w:rPr>
+              <w:t xml:space="preserve">V2 success</w:t>
+            </w:r>
+          </w:p>
+        </w:tc>
+        <w:tc>
+          <w:tcPr>
+            <w:tcW w:w="1450" w:type="dxa"/>
+            <w:tcBorders>
+              <w:top w:val="single" w:sz="1" w:space="0" w:color="BBBBBB"/>
+              <w:left w:val="single" w:sz="1" w:space="0" w:color="BBBBBB"/>
+              <w:bottom w:val="single" w:sz="1" w:space="0" w:color="BBBBBB"/>
+              <w:right w:val="single" w:sz="1" w:space="0" w:color="BBBBBB"/>
+            </w:tcBorders>
+            <w:shd w:val="clear" w:color="auto" w:fill="DCE6F1"/>
+            <w:tcMar>
+              <w:top w:w="60" w:type="dxa"/>
+              <w:left w:w="100" w:type="dxa"/>
+              <w:bottom w:w="60" w:type="dxa"/>
+              <w:right w:w="100" w:type="dxa"/>
+            </w:tcMar>
+          </w:tcPr>
+          <w:p>
+            <w:pPr>
+              <w:jc w:val="center"/>
+              <w:rPr>
+                <w:rFonts w:ascii="Times New Roman" w:hAnsi="Times New Roman" w:cs="Times New Roman"/>
+              </w:rPr>
+            </w:pPr>
+            <w:r>
+              <w:rPr>
+                <w:rFonts w:ascii="Times New Roman" w:hAnsi="Times New Roman" w:cs="Times New Roman"/>
+                <w:b/>
+                <w:bCs/>
+                <w:sz w:val="18"/>
+                <w:szCs w:val="18"/>
+              </w:rPr>
+              <w:t xml:space="preserve">V2 MPI</w:t>
+            </w:r>
+          </w:p>
+        </w:tc>
+      </w:tr>
+      <w:tr>
+        <w:trPr>
+          <w:jc w:val="center"/>
+        </w:trPr>
+        <w:tc>
+          <w:tcPr>
+            <w:tcW w:w="2300" w:type="dxa"/>
+            <w:tcBorders>
+              <w:top w:val="single" w:sz="1" w:space="0" w:color="BBBBBB"/>
+              <w:left w:val="single" w:sz="1" w:space="0" w:color="BBBBBB"/>
+              <w:bottom w:val="single" w:sz="1" w:space="0" w:color="BBBBBB"/>
+              <w:right w:val="single" w:sz="1" w:space="0" w:color="BBBBBB"/>
+            </w:tcBorders>
+            <w:tcMar>
+              <w:top w:w="60" w:type="dxa"/>
+              <w:left w:w="100" w:type="dxa"/>
+              <w:bottom w:w="60" w:type="dxa"/>
+              <w:right w:w="100" w:type="dxa"/>
+            </w:tcMar>
+          </w:tcPr>
+          <w:p>
+            <w:pPr>
+              <w:jc w:val="center"/>
+              <w:rPr>
+                <w:rFonts w:ascii="Times New Roman" w:hAnsi="Times New Roman" w:cs="Times New Roman"/>
+              </w:rPr>
+            </w:pPr>
+            <w:r>
+              <w:rPr>
+                <w:rFonts w:ascii="Times New Roman" w:hAnsi="Times New Roman" w:cs="Times New Roman"/>
+                <w:sz w:val="18"/>
+                <w:szCs w:val="18"/>
+              </w:rPr>
+              <w:t xml:space="preserve">None (baseline)</w:t>
+            </w:r>
+          </w:p>
+        </w:tc>
+        <w:tc>
+          <w:tcPr>
+            <w:tcW w:w="1450" w:type="dxa"/>
+            <w:tcBorders>
+              <w:top w:val="single" w:sz="1" w:space="0" w:color="BBBBBB"/>
+              <w:left w:val="single" w:sz="1" w:space="0" w:color="BBBBBB"/>
+              <w:bottom w:val="single" w:sz="1" w:space="0" w:color="BBBBBB"/>
+              <w:right w:val="single" w:sz="1" w:space="0" w:color="BBBBBB"/>
+            </w:tcBorders>
+            <w:tcMar>
+              <w:top w:w="60" w:type="dxa"/>
+              <w:left w:w="100" w:type="dxa"/>
+              <w:bottom w:w="60" w:type="dxa"/>
+              <w:right w:w="100" w:type="dxa"/>
+            </w:tcMar>
+          </w:tcPr>
+          <w:p>
+            <w:pPr>
+              <w:jc w:val="center"/>
+              <w:rPr>
+                <w:rFonts w:ascii="Times New Roman" w:hAnsi="Times New Roman" w:cs="Times New Roman"/>
+              </w:rPr>
+            </w:pPr>
+            <w:r>
+              <w:rPr>
+                <w:rFonts w:ascii="Times New Roman" w:hAnsi="Times New Roman" w:cs="Times New Roman"/>
+                <w:sz w:val="18"/>
+                <w:szCs w:val="18"/>
+              </w:rPr>
+              <w:t xml:space="preserve">93.3%*</w:t>
+            </w:r>
+          </w:p>
+        </w:tc>
+        <w:tc>
+          <w:tcPr>
+            <w:tcW w:w="1450" w:type="dxa"/>
+            <w:tcBorders>
+              <w:top w:val="single" w:sz="1" w:space="0" w:color="BBBBBB"/>
+              <w:left w:val="single" w:sz="1" w:space="0" w:color="BBBBBB"/>
+              <w:bottom w:val="single" w:sz="1" w:space="0" w:color="BBBBBB"/>
+              <w:right w:val="single" w:sz="1" w:space="0" w:color="BBBBBB"/>
+            </w:tcBorders>
+            <w:tcMar>
+              <w:top w:w="60" w:type="dxa"/>
+              <w:left w:w="100" w:type="dxa"/>
+              <w:bottom w:w="60" w:type="dxa"/>
+              <w:right w:w="100" w:type="dxa"/>
+            </w:tcMar>
+          </w:tcPr>
+          <w:p>
+            <w:pPr>
+              <w:jc w:val="center"/>
+              <w:rPr>
+                <w:rFonts w:ascii="Times New Roman" w:hAnsi="Times New Roman" w:cs="Times New Roman"/>
+              </w:rPr>
+            </w:pPr>
+            <w:r>
+              <w:rPr>
+                <w:rFonts w:ascii="Times New Roman" w:hAnsi="Times New Roman" w:cs="Times New Roman"/>
+                <w:sz w:val="18"/>
+                <w:szCs w:val="18"/>
+              </w:rPr>
+              <w:t xml:space="preserve">0.873</w:t>
+            </w:r>
+          </w:p>
+        </w:tc>
+        <w:tc>
+          <w:tcPr>
+            <w:tcW w:w="1450" w:type="dxa"/>
+            <w:tcBorders>
+              <w:top w:val="single" w:sz="1" w:space="0" w:color="BBBBBB"/>
+              <w:left w:val="single" w:sz="1" w:space="0" w:color="BBBBBB"/>
+              <w:bottom w:val="single" w:sz="1" w:space="0" w:color="BBBBBB"/>
+              <w:right w:val="single" w:sz="1" w:space="0" w:color="BBBBBB"/>
+            </w:tcBorders>
+            <w:tcMar>
+              <w:top w:w="60" w:type="dxa"/>
+              <w:left w:w="100" w:type="dxa"/>
+              <w:bottom w:w="60" w:type="dxa"/>
+              <w:right w:w="100" w:type="dxa"/>
+            </w:tcMar>
+          </w:tcPr>
+          <w:p>
+            <w:pPr>
+              <w:jc w:val="center"/>
+              <w:rPr>
+                <w:rFonts w:ascii="Times New Roman" w:hAnsi="Times New Roman" w:cs="Times New Roman"/>
+              </w:rPr>
+            </w:pPr>
+            <w:r>
+              <w:rPr>
+                <w:rFonts w:ascii="Times New Roman" w:hAnsi="Times New Roman" w:cs="Times New Roman"/>
+                <w:sz w:val="18"/>
+                <w:szCs w:val="18"/>
+              </w:rPr>
+              <w:t xml:space="preserve">86.7%</w:t>
+            </w:r>
+          </w:p>
+        </w:tc>
+        <w:tc>
+          <w:tcPr>
+            <w:tcW w:w="1450" w:type="dxa"/>
+            <w:tcBorders>
+              <w:top w:val="single" w:sz="1" w:space="0" w:color="BBBBBB"/>
+              <w:left w:val="single" w:sz="1" w:space="0" w:color="BBBBBB"/>
+              <w:bottom w:val="single" w:sz="1" w:space="0" w:color="BBBBBB"/>
+              <w:right w:val="single" w:sz="1" w:space="0" w:color="BBBBBB"/>
+            </w:tcBorders>
+            <w:tcMar>
+              <w:top w:w="60" w:type="dxa"/>
+              <w:left w:w="100" w:type="dxa"/>
+              <w:bottom w:w="60" w:type="dxa"/>
+              <w:right w:w="100" w:type="dxa"/>
+            </w:tcMar>
+          </w:tcPr>
+          <w:p>
+            <w:pPr>
+              <w:jc w:val="center"/>
+              <w:rPr>
+                <w:rFonts w:ascii="Times New Roman" w:hAnsi="Times New Roman" w:cs="Times New Roman"/>
+              </w:rPr>
+            </w:pPr>
+            <w:r>
+              <w:rPr>
+                <w:rFonts w:ascii="Times New Roman" w:hAnsi="Times New Roman" w:cs="Times New Roman"/>
+                <w:sz w:val="18"/>
+                <w:szCs w:val="18"/>
+              </w:rPr>
+              <w:t xml:space="preserve">0.816</w:t>
+            </w:r>
+          </w:p>
+        </w:tc>
+      </w:tr>
+      <w:tr>
+        <w:trPr>
+          <w:jc w:val="center"/>
+        </w:trPr>
+        <w:tc>
+          <w:tcPr>
+            <w:tcW w:w="2300" w:type="dxa"/>
+            <w:tcBorders>
+              <w:top w:val="single" w:sz="1" w:space="0" w:color="BBBBBB"/>
+              <w:left w:val="single" w:sz="1" w:space="0" w:color="BBBBBB"/>
+              <w:bottom w:val="single" w:sz="1" w:space="0" w:color="BBBBBB"/>
+              <w:right w:val="single" w:sz="1" w:space="0" w:color="BBBBBB"/>
+            </w:tcBorders>
+            <w:tcMar>
+              <w:top w:w="60" w:type="dxa"/>
+              <w:left w:w="100" w:type="dxa"/>
+              <w:bottom w:w="60" w:type="dxa"/>
+              <w:right w:w="100" w:type="dxa"/>
+            </w:tcMar>
+          </w:tcPr>
+          <w:p>
+            <w:pPr>
+              <w:jc w:val="center"/>
+              <w:rPr>
+                <w:rFonts w:ascii="Times New Roman" w:hAnsi="Times New Roman" w:cs="Times New Roman"/>
+              </w:rPr>
+            </w:pPr>
+            <w:r>
+              <w:rPr>
+                <w:rFonts w:ascii="Times New Roman" w:hAnsi="Times New Roman" w:cs="Times New Roman"/>
+                <w:sz w:val="18"/>
+                <w:szCs w:val="18"/>
+              </w:rPr>
+              <w:t xml:space="preserve">Lawnmower</w:t>
+            </w:r>
+          </w:p>
+        </w:tc>
+        <w:tc>
+          <w:tcPr>
+            <w:tcW w:w="1450" w:type="dxa"/>
+            <w:tcBorders>
+              <w:top w:val="single" w:sz="1" w:space="0" w:color="BBBBBB"/>
+              <w:left w:val="single" w:sz="1" w:space="0" w:color="BBBBBB"/>
+              <w:bottom w:val="single" w:sz="1" w:space="0" w:color="BBBBBB"/>
+              <w:right w:val="single" w:sz="1" w:space="0" w:color="BBBBBB"/>
+            </w:tcBorders>
+            <w:tcMar>
+              <w:top w:w="60" w:type="dxa"/>
+              <w:left w:w="100" w:type="dxa"/>
+              <w:bottom w:w="60" w:type="dxa"/>
+              <w:right w:w="100" w:type="dxa"/>
+            </w:tcMar>
+          </w:tcPr>
+          <w:p>
+            <w:pPr>
+              <w:jc w:val="center"/>
+              <w:rPr>
+                <w:rFonts w:ascii="Times New Roman" w:hAnsi="Times New Roman" w:cs="Times New Roman"/>
+              </w:rPr>
+            </w:pPr>
+            <w:r>
+              <w:rPr>
+                <w:rFonts w:ascii="Times New Roman" w:hAnsi="Times New Roman" w:cs="Times New Roman"/>
+                <w:sz w:val="18"/>
+                <w:szCs w:val="18"/>
+              </w:rPr>
+              <w:t xml:space="preserve">93.3%</w:t>
+            </w:r>
+          </w:p>
+        </w:tc>
+        <w:tc>
+          <w:tcPr>
+            <w:tcW w:w="1450" w:type="dxa"/>
+            <w:tcBorders>
+              <w:top w:val="single" w:sz="1" w:space="0" w:color="BBBBBB"/>
+              <w:left w:val="single" w:sz="1" w:space="0" w:color="BBBBBB"/>
+              <w:bottom w:val="single" w:sz="1" w:space="0" w:color="BBBBBB"/>
+              <w:right w:val="single" w:sz="1" w:space="0" w:color="BBBBBB"/>
+            </w:tcBorders>
+            <w:tcMar>
+              <w:top w:w="60" w:type="dxa"/>
+              <w:left w:w="100" w:type="dxa"/>
+              <w:bottom w:w="60" w:type="dxa"/>
+              <w:right w:w="100" w:type="dxa"/>
+            </w:tcMar>
+          </w:tcPr>
+          <w:p>
+            <w:pPr>
+              <w:jc w:val="center"/>
+              <w:rPr>
+                <w:rFonts w:ascii="Times New Roman" w:hAnsi="Times New Roman" w:cs="Times New Roman"/>
+              </w:rPr>
+            </w:pPr>
+            <w:r>
+              <w:rPr>
+                <w:rFonts w:ascii="Times New Roman" w:hAnsi="Times New Roman" w:cs="Times New Roman"/>
+                <w:sz w:val="18"/>
+                <w:szCs w:val="18"/>
+              </w:rPr>
+              <w:t xml:space="preserve">0.899</w:t>
+            </w:r>
+          </w:p>
+        </w:tc>
+        <w:tc>
+          <w:tcPr>
+            <w:tcW w:w="1450" w:type="dxa"/>
+            <w:tcBorders>
+              <w:top w:val="single" w:sz="1" w:space="0" w:color="BBBBBB"/>
+              <w:left w:val="single" w:sz="1" w:space="0" w:color="BBBBBB"/>
+              <w:bottom w:val="single" w:sz="1" w:space="0" w:color="BBBBBB"/>
+              <w:right w:val="single" w:sz="1" w:space="0" w:color="BBBBBB"/>
+            </w:tcBorders>
+            <w:tcMar>
+              <w:top w:w="60" w:type="dxa"/>
+              <w:left w:w="100" w:type="dxa"/>
+              <w:bottom w:w="60" w:type="dxa"/>
+              <w:right w:w="100" w:type="dxa"/>
+            </w:tcMar>
+          </w:tcPr>
+          <w:p>
+            <w:pPr>
+              <w:jc w:val="center"/>
+              <w:rPr>
+                <w:rFonts w:ascii="Times New Roman" w:hAnsi="Times New Roman" w:cs="Times New Roman"/>
+              </w:rPr>
+            </w:pPr>
+            <w:r>
+              <w:rPr>
+                <w:rFonts w:ascii="Times New Roman" w:hAnsi="Times New Roman" w:cs="Times New Roman"/>
+                <w:sz w:val="18"/>
+                <w:szCs w:val="18"/>
+              </w:rPr>
+              <w:t xml:space="preserve">76.7%</w:t>
+            </w:r>
+          </w:p>
+        </w:tc>
+        <w:tc>
+          <w:tcPr>
+            <w:tcW w:w="1450" w:type="dxa"/>
+            <w:tcBorders>
+              <w:top w:val="single" w:sz="1" w:space="0" w:color="BBBBBB"/>
+              <w:left w:val="single" w:sz="1" w:space="0" w:color="BBBBBB"/>
+              <w:bottom w:val="single" w:sz="1" w:space="0" w:color="BBBBBB"/>
+              <w:right w:val="single" w:sz="1" w:space="0" w:color="BBBBBB"/>
+            </w:tcBorders>
+            <w:tcMar>
+              <w:top w:w="60" w:type="dxa"/>
+              <w:left w:w="100" w:type="dxa"/>
+              <w:bottom w:w="60" w:type="dxa"/>
+              <w:right w:w="100" w:type="dxa"/>
+            </w:tcMar>
+          </w:tcPr>
+          <w:p>
+            <w:pPr>
+              <w:jc w:val="center"/>
+              <w:rPr>
+                <w:rFonts w:ascii="Times New Roman" w:hAnsi="Times New Roman" w:cs="Times New Roman"/>
+              </w:rPr>
+            </w:pPr>
+            <w:r>
+              <w:rPr>
+                <w:rFonts w:ascii="Times New Roman" w:hAnsi="Times New Roman" w:cs="Times New Roman"/>
+                <w:sz w:val="18"/>
+                <w:szCs w:val="18"/>
+              </w:rPr>
+              <w:t xml:space="preserve">0.798</w:t>
+            </w:r>
+          </w:p>
+        </w:tc>
+      </w:tr>
+      <w:tr>
+        <w:trPr>
+          <w:jc w:val="center"/>
+        </w:trPr>
+        <w:tc>
+          <w:tcPr>
+            <w:tcW w:w="2300" w:type="dxa"/>
+            <w:tcBorders>
+              <w:top w:val="single" w:sz="1" w:space="0" w:color="BBBBBB"/>
+              <w:left w:val="single" w:sz="1" w:space="0" w:color="BBBBBB"/>
+              <w:bottom w:val="single" w:sz="1" w:space="0" w:color="BBBBBB"/>
+              <w:right w:val="single" w:sz="1" w:space="0" w:color="BBBBBB"/>
+            </w:tcBorders>
+            <w:tcMar>
+              <w:top w:w="60" w:type="dxa"/>
+              <w:left w:w="100" w:type="dxa"/>
+              <w:bottom w:w="60" w:type="dxa"/>
+              <w:right w:w="100" w:type="dxa"/>
+            </w:tcMar>
+          </w:tcPr>
+          <w:p>
+            <w:pPr>
+              <w:jc w:val="center"/>
+              <w:rPr>
+                <w:rFonts w:ascii="Times New Roman" w:hAnsi="Times New Roman" w:cs="Times New Roman"/>
+              </w:rPr>
+            </w:pPr>
+            <w:r>
+              <w:rPr>
+                <w:rFonts w:ascii="Times New Roman" w:hAnsi="Times New Roman" w:cs="Times New Roman"/>
+                <w:sz w:val="18"/>
+                <w:szCs w:val="18"/>
+              </w:rPr>
+              <w:t xml:space="preserve">Threat-informed</w:t>
+            </w:r>
+          </w:p>
+        </w:tc>
+        <w:tc>
+          <w:tcPr>
+            <w:tcW w:w="1450" w:type="dxa"/>
+            <w:tcBorders>
+              <w:top w:val="single" w:sz="1" w:space="0" w:color="BBBBBB"/>
+              <w:left w:val="single" w:sz="1" w:space="0" w:color="BBBBBB"/>
+              <w:bottom w:val="single" w:sz="1" w:space="0" w:color="BBBBBB"/>
+              <w:right w:val="single" w:sz="1" w:space="0" w:color="BBBBBB"/>
+            </w:tcBorders>
+            <w:tcMar>
+              <w:top w:w="60" w:type="dxa"/>
+              <w:left w:w="100" w:type="dxa"/>
+              <w:bottom w:w="60" w:type="dxa"/>
+              <w:right w:w="100" w:type="dxa"/>
+            </w:tcMar>
+          </w:tcPr>
+          <w:p>
+            <w:pPr>
+              <w:jc w:val="center"/>
+              <w:rPr>
+                <w:rFonts w:ascii="Times New Roman" w:hAnsi="Times New Roman" w:cs="Times New Roman"/>
+              </w:rPr>
+            </w:pPr>
+            <w:r>
+              <w:rPr>
+                <w:rFonts w:ascii="Times New Roman" w:hAnsi="Times New Roman" w:cs="Times New Roman"/>
+                <w:sz w:val="18"/>
+                <w:szCs w:val="18"/>
+              </w:rPr>
+              <w:t xml:space="preserve">96.7%</w:t>
+            </w:r>
+          </w:p>
+        </w:tc>
+        <w:tc>
+          <w:tcPr>
+            <w:tcW w:w="1450" w:type="dxa"/>
+            <w:tcBorders>
+              <w:top w:val="single" w:sz="1" w:space="0" w:color="BBBBBB"/>
+              <w:left w:val="single" w:sz="1" w:space="0" w:color="BBBBBB"/>
+              <w:bottom w:val="single" w:sz="1" w:space="0" w:color="BBBBBB"/>
+              <w:right w:val="single" w:sz="1" w:space="0" w:color="BBBBBB"/>
+            </w:tcBorders>
+            <w:tcMar>
+              <w:top w:w="60" w:type="dxa"/>
+              <w:left w:w="100" w:type="dxa"/>
+              <w:bottom w:w="60" w:type="dxa"/>
+              <w:right w:w="100" w:type="dxa"/>
+            </w:tcMar>
+          </w:tcPr>
+          <w:p>
+            <w:pPr>
+              <w:jc w:val="center"/>
+              <w:rPr>
+                <w:rFonts w:ascii="Times New Roman" w:hAnsi="Times New Roman" w:cs="Times New Roman"/>
+              </w:rPr>
+            </w:pPr>
+            <w:r>
+              <w:rPr>
+                <w:rFonts w:ascii="Times New Roman" w:hAnsi="Times New Roman" w:cs="Times New Roman"/>
+                <w:sz w:val="18"/>
+                <w:szCs w:val="18"/>
+              </w:rPr>
+              <w:t xml:space="preserve">0.893</w:t>
+            </w:r>
+          </w:p>
+        </w:tc>
+        <w:tc>
+          <w:tcPr>
+            <w:tcW w:w="1450" w:type="dxa"/>
+            <w:tcBorders>
+              <w:top w:val="single" w:sz="1" w:space="0" w:color="BBBBBB"/>
+              <w:left w:val="single" w:sz="1" w:space="0" w:color="BBBBBB"/>
+              <w:bottom w:val="single" w:sz="1" w:space="0" w:color="BBBBBB"/>
+              <w:right w:val="single" w:sz="1" w:space="0" w:color="BBBBBB"/>
+            </w:tcBorders>
+            <w:tcMar>
+              <w:top w:w="60" w:type="dxa"/>
+              <w:left w:w="100" w:type="dxa"/>
+              <w:bottom w:w="60" w:type="dxa"/>
+              <w:right w:w="100" w:type="dxa"/>
+            </w:tcMar>
+          </w:tcPr>
+          <w:p>
+            <w:pPr>
+              <w:jc w:val="center"/>
+              <w:rPr>
+                <w:rFonts w:ascii="Times New Roman" w:hAnsi="Times New Roman" w:cs="Times New Roman"/>
+              </w:rPr>
+            </w:pPr>
+            <w:r>
+              <w:rPr>
+                <w:rFonts w:ascii="Times New Roman" w:hAnsi="Times New Roman" w:cs="Times New Roman"/>
+                <w:sz w:val="18"/>
+                <w:szCs w:val="18"/>
+              </w:rPr>
+              <w:t xml:space="preserve">80.0%</w:t>
+            </w:r>
+          </w:p>
+        </w:tc>
+        <w:tc>
+          <w:tcPr>
+            <w:tcW w:w="1450" w:type="dxa"/>
+            <w:tcBorders>
+              <w:top w:val="single" w:sz="1" w:space="0" w:color="BBBBBB"/>
+              <w:left w:val="single" w:sz="1" w:space="0" w:color="BBBBBB"/>
+              <w:bottom w:val="single" w:sz="1" w:space="0" w:color="BBBBBB"/>
+              <w:right w:val="single" w:sz="1" w:space="0" w:color="BBBBBB"/>
+            </w:tcBorders>
+            <w:tcMar>
+              <w:top w:w="60" w:type="dxa"/>
+              <w:left w:w="100" w:type="dxa"/>
+              <w:bottom w:w="60" w:type="dxa"/>
+              <w:right w:w="100" w:type="dxa"/>
+            </w:tcMar>
+          </w:tcPr>
+          <w:p>
+            <w:pPr>
+              <w:jc w:val="center"/>
+              <w:rPr>
+                <w:rFonts w:ascii="Times New Roman" w:hAnsi="Times New Roman" w:cs="Times New Roman"/>
+              </w:rPr>
+            </w:pPr>
+            <w:r>
+              <w:rPr>
+                <w:rFonts w:ascii="Times New Roman" w:hAnsi="Times New Roman" w:cs="Times New Roman"/>
+                <w:sz w:val="18"/>
+                <w:szCs w:val="18"/>
+              </w:rPr>
+              <w:t xml:space="preserve">0.816</w:t>
+            </w:r>
+          </w:p>
+        </w:tc>
+      </w:tr>
+      <w:tr>
+        <w:trPr>
+          <w:jc w:val="center"/>
+        </w:trPr>
+        <w:tc>
+          <w:tcPr>
+            <w:tcW w:w="2300" w:type="dxa"/>
+            <w:tcBorders>
+              <w:top w:val="single" w:sz="1" w:space="0" w:color="BBBBBB"/>
+              <w:left w:val="single" w:sz="1" w:space="0" w:color="BBBBBB"/>
+              <w:bottom w:val="single" w:sz="1" w:space="0" w:color="BBBBBB"/>
+              <w:right w:val="single" w:sz="1" w:space="0" w:color="BBBBBB"/>
+            </w:tcBorders>
+            <w:tcMar>
+              <w:top w:w="60" w:type="dxa"/>
+              <w:left w:w="100" w:type="dxa"/>
+              <w:bottom w:w="60" w:type="dxa"/>
+              <w:right w:w="100" w:type="dxa"/>
+            </w:tcMar>
+          </w:tcPr>
+          <w:p>
+            <w:pPr>
+              <w:jc w:val="center"/>
+              <w:rPr>
+                <w:rFonts w:ascii="Times New Roman" w:hAnsi="Times New Roman" w:cs="Times New Roman"/>
+              </w:rPr>
+            </w:pPr>
+            <w:r>
+              <w:rPr>
+                <w:rFonts w:ascii="Times New Roman" w:hAnsi="Times New Roman" w:cs="Times New Roman"/>
+                <w:sz w:val="18"/>
+                <w:szCs w:val="18"/>
+              </w:rPr>
+              <w:t xml:space="preserve">Target-informed</w:t>
+            </w:r>
+          </w:p>
+        </w:tc>
+        <w:tc>
+          <w:tcPr>
+            <w:tcW w:w="1450" w:type="dxa"/>
+            <w:tcBorders>
+              <w:top w:val="single" w:sz="1" w:space="0" w:color="BBBBBB"/>
+              <w:left w:val="single" w:sz="1" w:space="0" w:color="BBBBBB"/>
+              <w:bottom w:val="single" w:sz="1" w:space="0" w:color="BBBBBB"/>
+              <w:right w:val="single" w:sz="1" w:space="0" w:color="BBBBBB"/>
+            </w:tcBorders>
+            <w:tcMar>
+              <w:top w:w="60" w:type="dxa"/>
+              <w:left w:w="100" w:type="dxa"/>
+              <w:bottom w:w="60" w:type="dxa"/>
+              <w:right w:w="100" w:type="dxa"/>
+            </w:tcMar>
+          </w:tcPr>
+          <w:p>
+            <w:pPr>
+              <w:jc w:val="center"/>
+              <w:rPr>
+                <w:rFonts w:ascii="Times New Roman" w:hAnsi="Times New Roman" w:cs="Times New Roman"/>
+              </w:rPr>
+            </w:pPr>
+            <w:r>
+              <w:rPr>
+                <w:rFonts w:ascii="Times New Roman" w:hAnsi="Times New Roman" w:cs="Times New Roman"/>
+                <w:sz w:val="18"/>
+                <w:szCs w:val="18"/>
+              </w:rPr>
+              <w:t xml:space="preserve">83.3%</w:t>
+            </w:r>
+          </w:p>
+        </w:tc>
+        <w:tc>
+          <w:tcPr>
+            <w:tcW w:w="1450" w:type="dxa"/>
+            <w:tcBorders>
+              <w:top w:val="single" w:sz="1" w:space="0" w:color="BBBBBB"/>
+              <w:left w:val="single" w:sz="1" w:space="0" w:color="BBBBBB"/>
+              <w:bottom w:val="single" w:sz="1" w:space="0" w:color="BBBBBB"/>
+              <w:right w:val="single" w:sz="1" w:space="0" w:color="BBBBBB"/>
+            </w:tcBorders>
+            <w:tcMar>
+              <w:top w:w="60" w:type="dxa"/>
+              <w:left w:w="100" w:type="dxa"/>
+              <w:bottom w:w="60" w:type="dxa"/>
+              <w:right w:w="100" w:type="dxa"/>
+            </w:tcMar>
+          </w:tcPr>
+          <w:p>
+            <w:pPr>
+              <w:jc w:val="center"/>
+              <w:rPr>
+                <w:rFonts w:ascii="Times New Roman" w:hAnsi="Times New Roman" w:cs="Times New Roman"/>
+              </w:rPr>
+            </w:pPr>
+            <w:r>
+              <w:rPr>
+                <w:rFonts w:ascii="Times New Roman" w:hAnsi="Times New Roman" w:cs="Times New Roman"/>
+                <w:sz w:val="18"/>
+                <w:szCs w:val="18"/>
+              </w:rPr>
+              <w:t xml:space="preserve">0.832</w:t>
+            </w:r>
+          </w:p>
+        </w:tc>
+        <w:tc>
+          <w:tcPr>
+            <w:tcW w:w="1450" w:type="dxa"/>
+            <w:tcBorders>
+              <w:top w:val="single" w:sz="1" w:space="0" w:color="BBBBBB"/>
+              <w:left w:val="single" w:sz="1" w:space="0" w:color="BBBBBB"/>
+              <w:bottom w:val="single" w:sz="1" w:space="0" w:color="BBBBBB"/>
+              <w:right w:val="single" w:sz="1" w:space="0" w:color="BBBBBB"/>
+            </w:tcBorders>
+            <w:tcMar>
+              <w:top w:w="60" w:type="dxa"/>
+              <w:left w:w="100" w:type="dxa"/>
+              <w:bottom w:w="60" w:type="dxa"/>
+              <w:right w:w="100" w:type="dxa"/>
+            </w:tcMar>
+          </w:tcPr>
+          <w:p>
+            <w:pPr>
+              <w:jc w:val="center"/>
+              <w:rPr>
+                <w:rFonts w:ascii="Times New Roman" w:hAnsi="Times New Roman" w:cs="Times New Roman"/>
+              </w:rPr>
+            </w:pPr>
+            <w:r>
+              <w:rPr>
+                <w:rFonts w:ascii="Times New Roman" w:hAnsi="Times New Roman" w:cs="Times New Roman"/>
+                <w:sz w:val="18"/>
+                <w:szCs w:val="18"/>
+              </w:rPr>
+              <w:t xml:space="preserve">86.7%</w:t>
+            </w:r>
+          </w:p>
+        </w:tc>
+        <w:tc>
+          <w:tcPr>
+            <w:tcW w:w="1450" w:type="dxa"/>
+            <w:tcBorders>
+              <w:top w:val="single" w:sz="1" w:space="0" w:color="BBBBBB"/>
+              <w:left w:val="single" w:sz="1" w:space="0" w:color="BBBBBB"/>
+              <w:bottom w:val="single" w:sz="1" w:space="0" w:color="BBBBBB"/>
+              <w:right w:val="single" w:sz="1" w:space="0" w:color="BBBBBB"/>
+            </w:tcBorders>
+            <w:tcMar>
+              <w:top w:w="60" w:type="dxa"/>
+              <w:left w:w="100" w:type="dxa"/>
+              <w:bottom w:w="60" w:type="dxa"/>
+              <w:right w:w="100" w:type="dxa"/>
+            </w:tcMar>
+          </w:tcPr>
+          <w:p>
+            <w:pPr>
+              <w:jc w:val="center"/>
+              <w:rPr>
+                <w:rFonts w:ascii="Times New Roman" w:hAnsi="Times New Roman" w:cs="Times New Roman"/>
+              </w:rPr>
+            </w:pPr>
+            <w:r>
+              <w:rPr>
+                <w:rFonts w:ascii="Times New Roman" w:hAnsi="Times New Roman" w:cs="Times New Roman"/>
+                <w:sz w:val="18"/>
+                <w:szCs w:val="18"/>
+              </w:rPr>
+              <w:t xml:space="preserve">0.787</w:t>
+            </w:r>
+          </w:p>
+        </w:tc>
+      </w:tr>
+      <w:tr>
+        <w:trPr>
+          <w:jc w:val="center"/>
+        </w:trPr>
+        <w:tc>
+          <w:tcPr>
+            <w:tcW w:w="2300" w:type="dxa"/>
+            <w:tcBorders>
+              <w:top w:val="single" w:sz="1" w:space="0" w:color="BBBBBB"/>
+              <w:left w:val="single" w:sz="1" w:space="0" w:color="BBBBBB"/>
+              <w:bottom w:val="single" w:sz="1" w:space="0" w:color="BBBBBB"/>
+              <w:right w:val="single" w:sz="1" w:space="0" w:color="BBBBBB"/>
+            </w:tcBorders>
+            <w:tcMar>
+              <w:top w:w="60" w:type="dxa"/>
+              <w:left w:w="100" w:type="dxa"/>
+              <w:bottom w:w="60" w:type="dxa"/>
+              <w:right w:w="100" w:type="dxa"/>
+            </w:tcMar>
+          </w:tcPr>
+          <w:p>
+            <w:pPr>
+              <w:jc w:val="center"/>
+              <w:rPr>
+                <w:rFonts w:ascii="Times New Roman" w:hAnsi="Times New Roman" w:cs="Times New Roman"/>
+              </w:rPr>
+            </w:pPr>
+            <w:r>
+              <w:rPr>
+                <w:rFonts w:ascii="Times New Roman" w:hAnsi="Times New Roman" w:cs="Times New Roman"/>
+                <w:sz w:val="18"/>
+                <w:szCs w:val="18"/>
+              </w:rPr>
+              <w:t xml:space="preserve">Hybrid</w:t>
+            </w:r>
+          </w:p>
+        </w:tc>
+        <w:tc>
+          <w:tcPr>
+            <w:tcW w:w="1450" w:type="dxa"/>
+            <w:tcBorders>
+              <w:top w:val="single" w:sz="1" w:space="0" w:color="BBBBBB"/>
+              <w:left w:val="single" w:sz="1" w:space="0" w:color="BBBBBB"/>
+              <w:bottom w:val="single" w:sz="1" w:space="0" w:color="BBBBBB"/>
+              <w:right w:val="single" w:sz="1" w:space="0" w:color="BBBBBB"/>
+            </w:tcBorders>
+            <w:tcMar>
+              <w:top w:w="60" w:type="dxa"/>
+              <w:left w:w="100" w:type="dxa"/>
+              <w:bottom w:w="60" w:type="dxa"/>
+              <w:right w:w="100" w:type="dxa"/>
+            </w:tcMar>
+          </w:tcPr>
+          <w:p>
+            <w:pPr>
+              <w:jc w:val="center"/>
+              <w:rPr>
+                <w:rFonts w:ascii="Times New Roman" w:hAnsi="Times New Roman" w:cs="Times New Roman"/>
+              </w:rPr>
+            </w:pPr>
+            <w:r>
+              <w:rPr>
+                <w:rFonts w:ascii="Times New Roman" w:hAnsi="Times New Roman" w:cs="Times New Roman"/>
+                <w:sz w:val="18"/>
+                <w:szCs w:val="18"/>
+              </w:rPr>
+              <w:t xml:space="preserve">83.3%</w:t>
+            </w:r>
+          </w:p>
+        </w:tc>
+        <w:tc>
+          <w:tcPr>
+            <w:tcW w:w="1450" w:type="dxa"/>
+            <w:tcBorders>
+              <w:top w:val="single" w:sz="1" w:space="0" w:color="BBBBBB"/>
+              <w:left w:val="single" w:sz="1" w:space="0" w:color="BBBBBB"/>
+              <w:bottom w:val="single" w:sz="1" w:space="0" w:color="BBBBBB"/>
+              <w:right w:val="single" w:sz="1" w:space="0" w:color="BBBBBB"/>
+            </w:tcBorders>
+            <w:tcMar>
+              <w:top w:w="60" w:type="dxa"/>
+              <w:left w:w="100" w:type="dxa"/>
+              <w:bottom w:w="60" w:type="dxa"/>
+              <w:right w:w="100" w:type="dxa"/>
+            </w:tcMar>
+          </w:tcPr>
+          <w:p>
+            <w:pPr>
+              <w:jc w:val="center"/>
+              <w:rPr>
+                <w:rFonts w:ascii="Times New Roman" w:hAnsi="Times New Roman" w:cs="Times New Roman"/>
+              </w:rPr>
+            </w:pPr>
+            <w:r>
+              <w:rPr>
+                <w:rFonts w:ascii="Times New Roman" w:hAnsi="Times New Roman" w:cs="Times New Roman"/>
+                <w:sz w:val="18"/>
+                <w:szCs w:val="18"/>
+              </w:rPr>
+              <w:t xml:space="preserve">0.825</w:t>
+            </w:r>
+          </w:p>
+        </w:tc>
+        <w:tc>
+          <w:tcPr>
+            <w:tcW w:w="1450" w:type="dxa"/>
+            <w:tcBorders>
+              <w:top w:val="single" w:sz="1" w:space="0" w:color="BBBBBB"/>
+              <w:left w:val="single" w:sz="1" w:space="0" w:color="BBBBBB"/>
+              <w:bottom w:val="single" w:sz="1" w:space="0" w:color="BBBBBB"/>
+              <w:right w:val="single" w:sz="1" w:space="0" w:color="BBBBBB"/>
+            </w:tcBorders>
+            <w:tcMar>
+              <w:top w:w="60" w:type="dxa"/>
+              <w:left w:w="100" w:type="dxa"/>
+              <w:bottom w:w="60" w:type="dxa"/>
+              <w:right w:w="100" w:type="dxa"/>
+            </w:tcMar>
+          </w:tcPr>
+          <w:p>
+            <w:pPr>
+              <w:jc w:val="center"/>
+              <w:rPr>
+                <w:rFonts w:ascii="Times New Roman" w:hAnsi="Times New Roman" w:cs="Times New Roman"/>
+              </w:rPr>
+            </w:pPr>
+            <w:r>
+              <w:rPr>
+                <w:rFonts w:ascii="Times New Roman" w:hAnsi="Times New Roman" w:cs="Times New Roman"/>
+                <w:sz w:val="18"/>
+                <w:szCs w:val="18"/>
+              </w:rPr>
+              <w:t xml:space="preserve">73.3%</w:t>
+            </w:r>
+          </w:p>
+        </w:tc>
+        <w:tc>
+          <w:tcPr>
+            <w:tcW w:w="1450" w:type="dxa"/>
+            <w:tcBorders>
+              <w:top w:val="single" w:sz="1" w:space="0" w:color="BBBBBB"/>
+              <w:left w:val="single" w:sz="1" w:space="0" w:color="BBBBBB"/>
+              <w:bottom w:val="single" w:sz="1" w:space="0" w:color="BBBBBB"/>
+              <w:right w:val="single" w:sz="1" w:space="0" w:color="BBBBBB"/>
+            </w:tcBorders>
+            <w:tcMar>
+              <w:top w:w="60" w:type="dxa"/>
+              <w:left w:w="100" w:type="dxa"/>
+              <w:bottom w:w="60" w:type="dxa"/>
+              <w:right w:w="100" w:type="dxa"/>
+            </w:tcMar>
+          </w:tcPr>
+          <w:p>
+            <w:pPr>
+              <w:jc w:val="center"/>
+              <w:rPr>
+                <w:rFonts w:ascii="Times New Roman" w:hAnsi="Times New Roman" w:cs="Times New Roman"/>
+              </w:rPr>
+            </w:pPr>
+            <w:r>
+              <w:rPr>
+                <w:rFonts w:ascii="Times New Roman" w:hAnsi="Times New Roman" w:cs="Times New Roman"/>
+                <w:sz w:val="18"/>
+                <w:szCs w:val="18"/>
+              </w:rPr>
+              <w:t xml:space="preserve">0.726</w:t>
+            </w:r>
+          </w:p>
+        </w:tc>
+      </w:tr>
+    </w:tbl>
+    <w:p>
+      <w:pPr>
+        <w:spacing w:before="120" w:after="80"/>
+        <w:jc w:val="both"/>
+        <w:rPr>
+          <w:rFonts w:ascii="Times New Roman" w:hAnsi="Times New Roman" w:cs="Times New Roman"/>
+        </w:rPr>
+      </w:pPr>
+      <w:r>
+        <w:rPr>
+          <w:rFonts w:ascii="Times New Roman" w:hAnsi="Times New Roman" w:cs="Times New Roman"/>
+        </w:rPr>
+        <w:t xml:space="preserve">No UAV strategy differs significantly from the baseline (Fisher's exact test on success rate, all p ≥ 0.33; Welch's t-test on MPI, all p ≥ 0.15); resolving a 10-point difference would need about 160–300 runs per arm. The orderings (threat-informed highest at standard density, no UAV strategy above the baseline at stress density) are therefore directional trends, as the IARIA AIVTS 2026 paper reports. *The V1 baseline cell ran at 8× instead of 4× and must be re-run.</w:t>
+      </w:r>
+    </w:p>
+    <w:p>
+      <w:pPr>
+        <w:pStyle w:val="Heading1"/>
+        <w:pBdr>
+          <w:bottom w:val="single" w:sz="4" w:space="1" w:color="auto"/>
+        </w:pBdr>
+        <w:rPr>
+          <w:rFonts w:ascii="Times New Roman" w:hAnsi="Times New Roman" w:cs="Times New Roman"/>
+          <w:color w:val="000000" w:themeColor="text1"/>
+        </w:rPr>
+      </w:pPr>
+      <w:r>
+        <w:rPr>
+          <w:rFonts w:ascii="Times New Roman" w:hAnsi="Times New Roman" w:cs="Times New Roman"/>
+          <w:color w:val="000000" w:themeColor="text1"/>
+        </w:rPr>
+        <w:t>8.  Planned Improvements</w:t>
       </w:r>
     </w:p>
     <w:p>
@@ -2886,7 +4030,7 @@
         <w:rPr>
           <w:rFonts w:ascii="Times New Roman" w:hAnsi="Times New Roman" w:cs="Times New Roman"/>
         </w:rPr>
-        <w:t>The simulation is functionally complete as a planning and evaluation tool. The following enhancements are in progress, ordered by priority:</w:t>
+        <w:t>Priorities set by the October 2026 code review (details in FUTURE_WORK.md):</w:t>
       </w:r>
     </w:p>
     <w:p>
@@ -2905,89 +4049,20 @@
         <w:rPr>
           <w:rFonts w:ascii="Times New Roman" w:hAnsi="Times New Roman" w:cs="Times New Roman"/>
         </w:rPr>
-        <w:t xml:space="preserve">Risk </w:t>
-      </w:r>
-      <w:proofErr w:type="spellStart"/>
-      <w:r>
-        <w:rPr>
-          <w:rFonts w:ascii="Times New Roman" w:hAnsi="Times New Roman" w:cs="Times New Roman"/>
-        </w:rPr>
-        <w:t>heatmap</w:t>
-      </w:r>
-      <w:proofErr w:type="spellEnd"/>
-      <w:r>
-        <w:rPr>
-          <w:rFonts w:ascii="Times New Roman" w:hAnsi="Times New Roman" w:cs="Times New Roman"/>
-        </w:rPr>
-        <w:t xml:space="preserve"> overlay </w:t>
-      </w:r>
-      <w:r>
-        <w:rPr>
-          <w:rFonts w:ascii="Times New Roman" w:hAnsi="Times New Roman" w:cs="Times New Roman"/>
-        </w:rPr>
-        <w:t>-</w:t>
-      </w:r>
-      <w:r>
-        <w:rPr>
-          <w:rFonts w:ascii="Times New Roman" w:hAnsi="Times New Roman" w:cs="Times New Roman"/>
-        </w:rPr>
-        <w:t xml:space="preserve"> expose the per-node threat cost computed by </w:t>
-      </w:r>
-      <w:proofErr w:type="spellStart"/>
-      <w:r>
-        <w:rPr>
-          <w:rFonts w:ascii="Times New Roman" w:hAnsi="Times New Roman" w:cs="Times New Roman"/>
-        </w:rPr>
-        <w:t>build_penalized_graph</w:t>
-      </w:r>
-      <w:proofErr w:type="spellEnd"/>
-      <w:r>
-        <w:rPr>
-          <w:rFonts w:ascii="Times New Roman" w:hAnsi="Times New Roman" w:cs="Times New Roman"/>
-        </w:rPr>
-        <w:t xml:space="preserve"> via a /</w:t>
-      </w:r>
-      <w:proofErr w:type="spellStart"/>
-      <w:r>
-        <w:rPr>
-          <w:rFonts w:ascii="Times New Roman" w:hAnsi="Times New Roman" w:cs="Times New Roman"/>
-        </w:rPr>
-        <w:t>api</w:t>
-      </w:r>
-      <w:proofErr w:type="spellEnd"/>
-      <w:r>
-        <w:rPr>
-          <w:rFonts w:ascii="Times New Roman" w:hAnsi="Times New Roman" w:cs="Times New Roman"/>
-        </w:rPr>
-        <w:t>/sim/</w:t>
-      </w:r>
-      <w:proofErr w:type="spellStart"/>
-      <w:r>
-        <w:rPr>
-          <w:rFonts w:ascii="Times New Roman" w:hAnsi="Times New Roman" w:cs="Times New Roman"/>
-        </w:rPr>
-        <w:t>costmap</w:t>
-      </w:r>
-      <w:proofErr w:type="spellEnd"/>
-      <w:r>
-        <w:rPr>
-          <w:rFonts w:ascii="Times New Roman" w:hAnsi="Times New Roman" w:cs="Times New Roman"/>
-        </w:rPr>
-        <w:t xml:space="preserve"> endpoint and render it with </w:t>
-      </w:r>
-      <w:proofErr w:type="spellStart"/>
-      <w:r>
-        <w:rPr>
-          <w:rFonts w:ascii="Times New Roman" w:hAnsi="Times New Roman" w:cs="Times New Roman"/>
-        </w:rPr>
-        <w:t>Leaflet.heat</w:t>
-      </w:r>
-      <w:proofErr w:type="spellEnd"/>
-      <w:r>
-        <w:rPr>
-          <w:rFonts w:ascii="Times New Roman" w:hAnsi="Times New Roman" w:cs="Times New Roman"/>
-        </w:rPr>
-        <w:t>, giving operators immediate visual insight into why agents choose specific routes.</w:t>
+        <w:t xml:space="preserve">Reproducible UAV study - pin library versions, re-run the V1 baseline at 4×, and repeat the study with seeded, paired scenarios, larger samples and a sweep of the decay parameters τ and W</w:t>
+      </w:r>
+      <w:r>
+        <w:rPr>
+          <w:rFonts w:ascii="Times New Roman" w:hAnsi="Times New Roman" w:cs="Times New Roman"/>
+          <w:vertAlign w:val="subscript"/>
+        </w:rPr>
+        <w:t xml:space="preserve">base</w:t>
+      </w:r>
+      <w:r>
+        <w:rPr>
+          <w:rFonts w:ascii="Times New Roman" w:hAnsi="Times New Roman" w:cs="Times New Roman"/>
+        </w:rPr>
+        <w:t xml:space="preserve">.</w:t>
       </w:r>
     </w:p>
     <w:p>
@@ -3006,19 +4081,7 @@
         <w:rPr>
           <w:rFonts w:ascii="Times New Roman" w:hAnsi="Times New Roman" w:cs="Times New Roman"/>
         </w:rPr>
-        <w:t xml:space="preserve">Post-mission freeze &amp; PDF export </w:t>
-      </w:r>
-      <w:r>
-        <w:rPr>
-          <w:rFonts w:ascii="Times New Roman" w:hAnsi="Times New Roman" w:cs="Times New Roman"/>
-        </w:rPr>
-        <w:t>-</w:t>
-      </w:r>
-      <w:r>
-        <w:rPr>
-          <w:rFonts w:ascii="Times New Roman" w:hAnsi="Times New Roman" w:cs="Times New Roman"/>
-        </w:rPr>
-        <w:t xml:space="preserve"> replace live controls with a Mission Complete panel on game-over, with final score, per-agent breakdown, and a one-click printable report.</w:t>
+        <w:t xml:space="preserve">Planner correctness - keep the projected street graph undirected (it now turns one-directional, disabling the maneuver check), step enemies once per tick, reset the UAV on restart, and use seconds instead of ticks.</w:t>
       </w:r>
     </w:p>
     <w:p>
@@ -3037,19 +4100,7 @@
         <w:rPr>
           <w:rFonts w:ascii="Times New Roman" w:hAnsi="Times New Roman" w:cs="Times New Roman"/>
         </w:rPr>
-        <w:t xml:space="preserve">Agent blackboard coordination </w:t>
-      </w:r>
-      <w:r>
-        <w:rPr>
-          <w:rFonts w:ascii="Times New Roman" w:hAnsi="Times New Roman" w:cs="Times New Roman"/>
-        </w:rPr>
-        <w:t>-</w:t>
-      </w:r>
-      <w:r>
-        <w:rPr>
-          <w:rFonts w:ascii="Times New Roman" w:hAnsi="Times New Roman" w:cs="Times New Roman"/>
-        </w:rPr>
-        <w:t xml:space="preserve"> shared state dictionary allowing agents to declare intended targets and build a collective threat model, enabling more sophisticated cooperative strategies.</w:t>
+        <w:t xml:space="preserve">UAV in the interface - a strategy selector in the planner, legend entries and a distinct UAV marker; failed missions saved to the history.</w:t>
       </w:r>
     </w:p>
     <w:p>
@@ -3068,33 +4119,7 @@
         <w:rPr>
           <w:rFonts w:ascii="Times New Roman" w:hAnsi="Times New Roman" w:cs="Times New Roman"/>
         </w:rPr>
-        <w:t xml:space="preserve">External controller integration </w:t>
-      </w:r>
-      <w:r>
-        <w:rPr>
-          <w:rFonts w:ascii="Times New Roman" w:hAnsi="Times New Roman" w:cs="Times New Roman"/>
-        </w:rPr>
-        <w:t>-</w:t>
-      </w:r>
-      <w:r>
-        <w:rPr>
-          <w:rFonts w:ascii="Times New Roman" w:hAnsi="Times New Roman" w:cs="Times New Roman"/>
-        </w:rPr>
-        <w:t xml:space="preserve"> the /</w:t>
-      </w:r>
-      <w:proofErr w:type="spellStart"/>
-      <w:r>
-        <w:rPr>
-          <w:rFonts w:ascii="Times New Roman" w:hAnsi="Times New Roman" w:cs="Times New Roman"/>
-        </w:rPr>
-        <w:t>api</w:t>
-      </w:r>
-      <w:proofErr w:type="spellEnd"/>
-      <w:r>
-        <w:rPr>
-          <w:rFonts w:ascii="Times New Roman" w:hAnsi="Times New Roman" w:cs="Times New Roman"/>
-        </w:rPr>
-        <w:t>/robot/telemetry endpoint already accepts real-time position overrides; completing this integration would allow the platform to serve as a live mission planner receiving telemetry from a physical or simulated vehicle.</w:t>
+        <w:t xml:space="preserve">Risk heat map and terrain overlays - render the planner's threat cost, including UAV penalties, and the road-cost classes in the live monitor.</w:t>
       </w:r>
     </w:p>
     <w:p>
@@ -3113,7 +4138,7 @@
         <w:rPr>
           <w:rFonts w:ascii="Times New Roman" w:hAnsi="Times New Roman" w:cs="Times New Roman"/>
         </w:rPr>
-        <w:t>Unit and integration test suite covering the pathfinding, scoring, and state management modules.</w:t>
+        <w:t xml:space="preserve">Research - multi-UAV coverage, communication loss and UAV energy limits, exploration-aware threat-informed coverage, learned strategy switching, a unit-test suite, and a Godot/ROS controller bridge.</w:t>
       </w:r>
     </w:p>
     <w:sectPr>
@@ -3836,6 +4861,7 @@
     <w:name w:val="heading 1"/>
     <w:qFormat/>
     <w:pPr>
+      <w:keepNext/>
       <w:spacing w:before="200" w:after="80"/>
       <w:outlineLvl w:val="0"/>
     </w:pPr>
@@ -3851,6 +4877,7 @@
     <w:name w:val="heading 2"/>
     <w:qFormat/>
     <w:pPr>
+      <w:keepNext/>
       <w:spacing w:before="140" w:after="60"/>
       <w:outlineLvl w:val="1"/>
     </w:pPr>

</xml_diff>